<commit_message>
v4 revision after round-2 review: fix darcy/many-input statements, oracle-comparator disclosure, mechanism wording, citations, checklist labels
Co-Authored-By: Claude Sonnet 5.5 <noreply@anthropic.com>
Claude-Session: https://claude.ai/code/session_017fdFnBNWwmmqUrWFrpu4HP
</commit_message>
<xml_diff>
--- a/Reinforced_Research_Project/manuscript/Final_Manuscript_v4.docx
+++ b/Reinforced_Research_Project/manuscript/Final_Manuscript_v4.docx
@@ -24,7 +24,7 @@
           <w:i/>
           <w:sz w:val="20"/>
         </w:rPr>
-        <w:t xml:space="preserve">A practical comparison of Gaussian-process and neural-network stand-in models on 36 simulated engineering problems</w:t>
+        <w:t xml:space="preserve">A comparison of Gaussian-process and neural-network stand-in models on 36 simulated test problems modelled on six application types</w:t>
       </w:r>
     </w:p>
     <w:p>
@@ -98,7 +98,7 @@
         <w:rPr>
           <w:sz w:val="20"/>
         </w:rPr>
-        <w:t xml:space="preserve">Engineers often need to run the same slow physics simulation hundreds of times, for design, calibration or uncertainty studies. A common shortcut is to run it a limited number of times and train a fast stand-in model, called a surrogate, on the results. This paper asks a practical question: with a budget of 32 to 1,024 simulation runs, should you build the stand-in from a Gaussian process (GP) working on a reduced basis, or train a neural network? We compared five such models on 36 simulated problems modelled on six types of application (flow through rock, heat conduction, pollutant transport, thermal runaway, spreading fronts, and waves). On smooth problems with few inputs, the reduced-basis GP was far more accurate, sometimes by two or three orders of magnitude, and the reduced-basis family reached 0.1% error on 19 of the 36 problems within the budget, against 10 for the networks. For rough accuracy targets (10% or 1%) the two families were about equally good. Several of the neural networks’ apparent wins came from the limits of the reduced basis rather than of the GP, and disappeared when the GP was applied to the full field. The GP’s edge was not caused by the reduced basis; it came mainly from searching its hyper-parameters over a wide range, since kernel ridge with a wide search came within a factor of about 3 of it. Results shifted noticeably when the networks were trained longer, so we give a short checklist for fair comparisons. A quick pilot check meant to predict the winner from 32 runs did not work reliably. All problems are simulated and the networks were only lightly tuned.</w:t>
+        <w:t xml:space="preserve">Engineers often need to run the same slow physics simulation hundreds of times, for design, calibration or uncertainty studies. A common shortcut is to run it a limited number of times and train a fast stand-in model, called a surrogate, on the results. This paper asks a practical question: with a budget of 32 to 1,024 simulation runs, should you build the stand-in from a Gaussian process (GP) working on a reduced basis, or train a neural network? We compared five such models on 36 simulated problems modelled on six types of application (flow through rock, heat conduction, pollutant transport, thermal runaway, spreading fronts, and waves). On smooth problems with few inputs, the reduced-basis GP was far more accurate, sometimes by two or three orders of magnitude, and the reduced-basis family reached 0.1% error on 19 of the 36 problems within the budget, against 10 for the networks (11 against 5 if the eight smooth problems added later are left out). For rough accuracy targets (10% or 1%) the two families were about equally good. Several of the neural networks’ apparent wins came from the limits of the reduced basis rather than of the GP, and disappeared when the GP was applied to the full field. The GP’s edge was not caused by the reduced basis; it came mainly from searching its hyper-parameters over a wide range, since kernel ridge with a wide hyper-parameter search came within a median factor of 6.5 of it with the same number of tuning trials, and about 3 with four times as many. Results shifted noticeably when the networks were trained longer, so we give a short checklist for fair comparisons. Most of our original hypotheses, including that a quick pilot check on 32 runs predicts the winner, were not confirmed. All problems are simulated and the networks were only lightly tuned.</w:t>
       </w:r>
     </w:p>
     <w:p>
@@ -184,7 +184,7 @@
         <w:rPr>
           <w:sz w:val="20"/>
         </w:rPr>
-        <w:t xml:space="preserve">The practical question is which kind of model to build. One long-standing route compresses the simulation output with proper orthogonal decomposition (POD), which finds a small set of typical shapes, and then learns how the weights of those shapes depend on the inputs, often with a Gaussian process [Hesthaven &amp; Ubbiali 2018; Guo &amp; Hesthaven 2018; Bhattacharya et al. 2021]. The other route trains a neural network to produce the whole output directly, sometimes through a narrow internal layer [Fresca &amp; Manzoni 2022; Franco et al. 2023]. Neural networks get most of the attention, but there are good reasons not to take their advantage for granted. Surveys of machine-learning solvers for fluid problems found that most papers claiming to beat a standard method had used a weak baseline [McGreivy &amp; Hakim 2024]. Kernel and Gaussian-process methods have been reported to be competitive with DeepONet [Lu et al. 2021] and the Fourier neural operator [Li et al. 2021] [Batlle et al. 2024], and in a POD framework for extruder flows a Gaussian process was reported to have several advantages over a neural network [Bērziņš et al. 2020, preprint]. A recent comparison of neural and polynomial surrogates found no universally superior method [Westermann et al. 2026, preprint]. Whether a small POD basis can work at all depends on how well the set of solutions can be approximated by a few shapes (the decay of the Kolmogorov n-width) [Cohen &amp; DeVore 2015], and this decay has been shown to be slow for wave problems with discontinuous data [Greif &amp; Urban 2019]. Finally, how much tuning a method gets and how results are reported can decide a comparison, which is why reporting results as a function of the tuning budget has been advocated [Dodge et al. 2019; Bouthillier et al. 2021].</w:t>
+        <w:t xml:space="preserve">The practical question is which kind of model to build. One long-standing route compresses the simulation output with proper orthogonal decomposition (POD), which finds a small set of typical shapes, and then learns how the weights of those shapes depend on the inputs, with a neural network [Hesthaven &amp; Ubbiali 2018; Bhattacharya et al. 2021] or a Gaussian process [Guo &amp; Hesthaven 2018]. The other route trains a neural network to produce the whole output directly, sometimes through a narrow internal layer [Fresca &amp; Manzoni 2022; Franco et al. 2023]. Neural networks get most of the attention, but there are good reasons not to take their advantage for granted. Surveys of machine-learning solvers for fluid problems found that most papers claiming to beat a standard method had used a weak baseline [McGreivy &amp; Hakim 2024]. Kernel and Gaussian-process methods have been reported to be competitive with DeepONet [Lu et al. 2021] and the Fourier neural operator [Li et al. 2021] [Batlle et al. 2024], and in a POD framework for extruder flows a Gaussian process was reported to have several advantages over a neural network [Bērziņš et al. 2020, preprint]. A recent comparison of neural and polynomial surrogates found no universally superior method [Westermann et al. 2026, preprint]. Whether a small POD basis can work at all depends on how well the set of solutions can be approximated by a few shapes (the decay of the Kolmogorov n-width) [Cohen &amp; DeVore 2015], and this decay has been shown to be slow for wave problems with discontinuous data [Greif &amp; Urban 2019]. Finally, how much tuning a method gets and how results are reported can decide a comparison, which is why reporting results as a function of the tuning budget has been advocated [Dodge et al. 2019; Bouthillier et al. 2021].</w:t>
       </w:r>
     </w:p>
     <w:p>
@@ -322,7 +322,7 @@
         <w:rPr>
           <w:sz w:val="20"/>
         </w:rPr>
-        <w:t xml:space="preserve">a neural network produces the whole output at once, either as a plain multilayer perceptron or through a narrow bottleneck layer. We say</w:t>
+        <w:t xml:space="preserve">a neural network produces the whole output at once, either as a plain multilayer perceptron or through a narrow bottleneck layer. In the main comparison we say</w:t>
       </w:r>
       <w:r>
         <w:rPr>
@@ -358,7 +358,7 @@
         <w:rPr>
           <w:sz w:val="20"/>
         </w:rPr>
-        <w:t xml:space="preserve">for a group when its best member, picked on held-out validation data and never on test data, has the smaller error.</w:t>
+        <w:t xml:space="preserve">for a group when its best member, picked on held-out validation data and never on test data, has the smaller error; the follow-up experiments in Section 4.3 and 4.5 use the best network by test error instead, which is stated where it matters.</w:t>
       </w:r>
     </w:p>
     <w:p>
@@ -458,7 +458,7 @@
         <w:rPr>
           <w:sz w:val="20"/>
         </w:rPr>
-        <w:t xml:space="preserve">The main hypotheses, code and success criteria were committed to version control before each group of runs. Several later experiments were designed after seeing earlier results, and one of them (the wide-range kernel ridge) was added because an independent AI-agent review of our own draft showed that an earlier control was too narrow. The Supplement lists which results came from which stage. The version-control history is our own, not an independent registry.</w:t>
+        <w:t xml:space="preserve">The main hypotheses, code and success criteria were committed to version control before each group of runs. Several later experiments were designed after seeing earlier results, and one of them (the wide-range kernel ridge) was added because a review of our own draft by an AI agent we asked to criticise it showed that an earlier control was too narrow. The Supplement lists which results came from which stage. The version-control history is our own, not an independent registry.</w:t>
       </w:r>
     </w:p>
     <w:bookmarkEnd w:id="22"/>
@@ -1361,7 +1361,7 @@
         <w:rPr>
           <w:sz w:val="20"/>
         </w:rPr>
-        <w:t xml:space="preserve">, but most of those were ties.</w:t>
+        <w:t xml:space="preserve">, but most of those were ties. In fact most of our original pre-registered hypotheses were not supported: networks did not win at small budgets, the gap did not shrink steadily as the budget grew, and the pilot check described in Section 4.4 did not predict the winner (three of four hypotheses failed; details in the Supplement).</w:t>
       </w:r>
     </w:p>
     <w:p>
@@ -1476,7 +1476,7 @@
         <w:rPr>
           <w:sz w:val="20"/>
         </w:rPr>
-        <w:t xml:space="preserve">up to about three orders of magnitude in the most favourable setting, one to two orders of magnitude after stronger network training</w:t>
+        <w:t xml:space="preserve">up to about three orders of magnitude in the most favourable setting, and still roughly 60 to 500 times on the most favourable problems after stronger network training</w:t>
       </w:r>
       <w:r>
         <w:rPr>
@@ -1499,7 +1499,7 @@
         <w:rPr>
           <w:sz w:val="20"/>
         </w:rPr>
-        <w:t xml:space="preserve">By application type, reduced-basis models were ahead on most heat-conduction and reaction problems, on the thermal-runaway problems and on the simple porous-flow problems. The networks led on a few problems with sharp moving features (transport_L2, kdv_L1) and on the porous-flow problems with a moving inclusion or many inputs (incl_L1, incl_L2, darcy_L2, darcyhd_L1); as Section 4.3 shows, a full-field GP often reverses the inclusion cases. For the problems with 16 and 32 inputs the results are not consistent across seeds and we cannot say which family is better there.</w:t>
+        <w:t xml:space="preserve">By application type, reduced-basis models were ahead on most heat-conduction and reaction problems, on the thermal-runaway problems and on the simple porous-flow problems. The networks led on a few problems with sharp moving features (transport_L2, kdv_L1) and on the porous-flow problems with a moving inclusion or many inputs (incl_L1, incl_L2, darcy_L2, darcyhd_L1); as Section 4.3 shows, a full-field GP often reverses the inclusion cases. For the many-input problems the picture is mixed. On the two porous-flow problems with 16 and 32 uncertain inputs and a rough permeability field (darcyhd) the networks were ahead by about a third, but not consistently across seeds, and on the 10-input version (darcy_L2) they were ahead by about 50%; on the two nearly linear problems with 16 and 32 inputs (darcylin) the reduced basis was ahead (factors of 3 and 1.5). We therefore cannot say which family is better when the inputs are many.</w:t>
       </w:r>
     </w:p>
     <w:bookmarkEnd w:id="27"/>
@@ -1523,7 +1523,7 @@
         <w:rPr>
           <w:sz w:val="20"/>
         </w:rPr>
-        <w:t xml:space="preserve">Often the real question is how many simulations are needed to reach a given accuracy. Table 2 counts the problems on which each group’s best model reached a target error within the 1,024 runs of our study. For a coarse target of 10% both groups got there on all 36 problems, usually with 64 runs or fewer. For 1%, they were about equal (27 against 28 problems). The difference shows up at the demanding end: 19 problems reach 0.1% error with the reduced-basis group, against 10 with the networks. The extra accuracy is mostly on smooth, low-dimensional problems; on several others (flows with moving inclusions, wave problems, shocks with sharp fronts) neither group reaches 1% within the budget.</w:t>
+        <w:t xml:space="preserve">Often the real question is how many simulations are needed to reach a given accuracy. Table 2 counts the problems on which each group’s best model reached a target error within the 1,024 runs of our study. For a coarse target of 10% both groups got there on all 36 problems, usually with 64 runs or fewer. For 1%, they were about equal (27 against 28 problems). The difference shows up at the demanding end: 19 problems reach 0.1% error with the reduced-basis group, against 10 with the networks. The 0.1% count includes eight smooth problems that we added later because we expected the GP to do well on them; on the 24 main problems it is 9 against 4. The extra accuracy is mostly on smooth, low-dimensional problems; on several others (flows with moving inclusions, wave problems, shocks with sharp fronts) neither group reaches 1% within the budget.</w:t>
       </w:r>
     </w:p>
     <w:tbl>
@@ -1899,7 +1899,7 @@
         <w:rPr>
           <w:sz w:val="20"/>
         </w:rPr>
-        <w:t xml:space="preserve">Kernel ridge regression is the same kind of model without the Gaussian process’s automatic fitting of its settings. With the narrow range of settings we first gave it, it was a median 14 times less accurate than the GP in the cells where the GP clearly wins. After an independent review of our draft (by an AI agent) pointed out that this range could not reach the very small regularisation that near-perfect fits need, we repeated the test with a wide range. The gap shrank to a factor of 6.5 with the same eight tuning trials and to 2.7 with 32 trials, and the wide-range kernel ridge beat the best neural network clearly in 64% of those cells. A polynomial, which has no kernel and no automatic fitting at all, was a median 10 times worse than the GP but still clearly beat the best network in 23 of the 52 cells where the GP did. Taken together, the advantage belongs to smooth regressors with a carefully and widely tuned regularisation, and not to the Gaussian process as such. We did not isolate the contribution of the GP’s marginal-likelihood fitting, because its cost is not matched by our kernel-ridge search.</w:t>
+        <w:t xml:space="preserve">Kernel ridge regression is the same kind of model without the Gaussian process’s automatic fitting of its settings. With the narrow range of settings we first gave it, it was a median 13 times less accurate than the GP in the 28 budget-and-problem combinations (budgets 64, 256 and 1,024) where the GP clearly beats the best network. After a review of our draft by an AI agent we had asked to criticise it pointed out that this range could not reach the very small regularisation that near-perfect fits need, we repeated the test with a wide range. On the same 28 combinations the gap shrank to a factor of 6.5 with the same eight tuning trials, and to 2.7 with 32 trials (only 57% of the combinations were within a factor of 3 even then), and the wide-range kernel ridge beat the best neural network clearly in 64% of them. A polynomial, which has no kernel and no automatic fitting at all, was a median 10 times worse than the GP but still clearly beat the best network in 23 of the 52 cells where the GP did. Taken together, the advantage belongs largely to smooth regressors whose regularisation is searched widely and finely, and not to the reduced basis; at equal numbers of tuning trials the Gaussian process was still clearly better than even the wide kernel ridge. We did not isolate the contribution of the GP’s marginal-likelihood fitting, because its cost is not matched by our kernel-ridge search.</w:t>
       </w:r>
     </w:p>
     <w:p>
@@ -1912,6 +1912,57 @@
           <w:i/>
           <w:sz w:val="20"/>
         </w:rPr>
+        <w:t xml:space="preserve">A note on how we compare in this section.</w:t>
+      </w:r>
+      <w:r>
+        <w:rPr>
+          <w:sz w:val="20"/>
+        </w:rPr>
+        <w:t xml:space="preserve"> </w:t>
+      </w:r>
+      <w:r>
+        <w:rPr>
+          <w:sz w:val="20"/>
+        </w:rPr>
+        <w:t xml:space="preserve">To pick the combinations where the GP clearly wins, we compare with the best network by</w:t>
+      </w:r>
+      <w:r>
+        <w:rPr>
+          <w:sz w:val="20"/>
+        </w:rPr>
+        <w:t xml:space="preserve"> </w:t>
+      </w:r>
+      <w:r>
+        <w:rPr>
+          <w:iCs/>
+          <w:i/>
+          <w:sz w:val="20"/>
+        </w:rPr>
+        <w:t xml:space="preserve">test</w:t>
+      </w:r>
+      <w:r>
+        <w:rPr>
+          <w:sz w:val="20"/>
+        </w:rPr>
+        <w:t xml:space="preserve"> </w:t>
+      </w:r>
+      <w:r>
+        <w:rPr>
+          <w:sz w:val="20"/>
+        </w:rPr>
+        <w:t xml:space="preserve">error, which favours the networks; this differs from the main comparison, where the best member of each group is chosen on validation data.</w:t>
+      </w:r>
+    </w:p>
+    <w:p>
+      <w:pPr>
+        <w:pStyle w:val="BodyText"/>
+      </w:pPr>
+      <w:r>
+        <w:rPr>
+          <w:iCs/>
+          <w:i/>
+          <w:sz w:val="20"/>
+        </w:rPr>
         <w:t xml:space="preserve">It is not a matter of the direct network being worse than the POD network.</w:t>
       </w:r>
       <w:r>
@@ -1937,14 +1988,14 @@
         </w:rPr>
         <w:drawing>
           <wp:inline>
-            <wp:extent cx="3733800" cy="2100262"/>
+            <wp:extent cx="3733800" cy="1768642"/>
             <wp:effectExtent b="0" l="0" r="0" t="0"/>
-            <wp:docPr descr="Figure 2. How much worse each alternative is than the Gaussian-process reduced model, on problems where that model clearly beats the best neural network. Each dot is one problem and budget; the dashed line marks a factor of 3. From the left: kernel ridge with a narrow search range, kernel ridge with a wide search range, a Gaussian process with one length-scale, and a Gaussian process on the full field without a reduced basis." title="" id="30" name="Picture"/>
+            <wp:docPr descr="Figure 2. How much worse each alternative is than the Gaussian-process reduced model, on problems where that model clearly beats the best neural network. Each dot is one problem and budget; the dashed line marks a factor of 3. From the left: kernel ridge with a narrow search range (52 combinations, all budgets), kernel ridge with a wide search range and 8 tuning trials, the same with 32 trials, a Gaussian process with one length-scale, and a Gaussian process on the full field without a reduced basis (28 combinations each)." title="" id="30" name="Picture"/>
             <a:graphic>
               <a:graphicData uri="http://schemas.openxmlformats.org/drawingml/2006/picture">
                 <pic:pic>
                   <pic:nvPicPr>
-                    <pic:cNvPr descr="/home/user/rp_c_7/Reinforced_Research_Project/manuscript/fig_mech3.png" id="31" name="Picture"/>
+                    <pic:cNvPr descr="/home/user/rp_c_7/Reinforced_Research_Project/manuscript/fig_mech4.png" id="31" name="Picture"/>
                     <pic:cNvPicPr>
                       <a:picLocks noChangeArrowheads="1" noChangeAspect="1"/>
                     </pic:cNvPicPr>
@@ -1958,7 +2009,7 @@
                   <pic:spPr bwMode="auto">
                     <a:xfrm>
                       <a:off x="0" y="0"/>
-                      <a:ext cx="3733800" cy="2100262"/>
+                      <a:ext cx="3733800" cy="1768642"/>
                     </a:xfrm>
                     <a:prstGeom prst="rect">
                       <a:avLst/>
@@ -1999,7 +2050,7 @@
         <w:rPr>
           <w:sz w:val="20"/>
         </w:rPr>
-        <w:t xml:space="preserve">How much worse each alternative is than the Gaussian-process reduced model, on problems where that model clearly beats the best neural network. Each dot is one problem and budget; the dashed line marks a factor of 3. From the left: kernel ridge with a narrow search range, kernel ridge with a wide search range, a Gaussian process with one length-scale, and a Gaussian process on the full field without a reduced basis.</w:t>
+        <w:t xml:space="preserve">How much worse each alternative is than the Gaussian-process reduced model, on problems where that model clearly beats the best neural network. Each dot is one problem and budget; the dashed line marks a factor of 3. From the left: kernel ridge with a narrow search range (52 combinations, all budgets), kernel ridge with a wide search range and 8 tuning trials, the same with 32 trials, a Gaussian process with one length-scale, and a Gaussian process on the full field without a reduced basis (28 combinations each).</w:t>
       </w:r>
     </w:p>
     <w:bookmarkEnd w:id="32"/>
@@ -2072,7 +2123,7 @@
         <w:rPr>
           <w:sz w:val="20"/>
         </w:rPr>
-        <w:t xml:space="preserve">Retraining the stored best networks for four times as many epochs improved nine in ten of them and moved the comparison toward the networks in all 15 of the 48 (problem, budget) cases whose classification changed; 9 ties became network wins. Double precision and a second-order polish lowered the networks’ error by a further half decade on average. The largest gaps survived: on 5 of the 7 problems where the reduced basis led by a factor of 10 or more, it still did after the stronger training, and on the other two (darcy_L1 and heat2d_L1) it led by factors of about 4 and 9. The networks’ error also stayed around 2·10⁻⁴ at best, far above the best GP errors of 10⁻⁷ to 10⁻⁵, which suggests training limits rather than a lack of capacity; but we did not explore every way of tuning a network, and a thoroughly tuned network could do better.</w:t>
+        <w:t xml:space="preserve">Retraining the stored best networks for four times as many epochs improved nine in ten of them and moved the comparison toward the networks in all 15 of the 48 (problem, budget) cases whose classification changed; 9 ties became network wins. Double precision and a second-order polish lowered the networks’ error by a further half decade on average. (This comparison again uses the best network by test error.) The largest gaps survived: on 5 of the 7 problems where the reduced basis led by a factor of 10 or more, it still did after the stronger training, and on the other two (darcy_L1 and heat2d_L1) it led by factors of about 4 and 9. The networks’ error also stayed around 2·10⁻⁴ at best, far above the best GP errors of 10⁻⁷ to 10⁻⁵, which suggests training limits rather than a lack of capacity; but we did not explore every way of tuning a network, and a thoroughly tuned network could do better.</w:t>
       </w:r>
     </w:p>
     <w:p>
@@ -2172,7 +2223,7 @@
         <w:rPr>
           <w:sz w:val="20"/>
         </w:rPr>
-        <w:t xml:space="preserve">The simple version has 4 inputs. With 256 runs the reduced-basis group reaches a mean error of 3.2e-04 and the best network 4.2e-03; with 1,024 runs the figures are 1.5e-04 and 2.1e-03. If 1% error is enough, either approach works from about 64 runs. With 16 inputs (darcyhd_L1) both groups are stuck at an error of about 6e-02 even with 1,024 runs, and they are within about 30% of each other; here the difficulty comes from the number of inputs, not from the choice of model.</w:t>
+        <w:t xml:space="preserve">The simple version has 4 inputs. With 256 runs the reduced-basis group reaches a mean error of 3.2e-04 and the best network 4.2e-03; with 1,024 runs the figures are 1.5e-04 and 2.1e-03. If 1% error is enough, either approach works from about 64 runs. With 16 inputs and a rough permeability field (darcyhd_L1) both groups are stuck at an error of about 4–6% even with 1,024 runs (reduced basis 5.8e-02, best network 4.3e-02). A smoother problem with the same number of inputs (darcylin_L1) is easy: the reduced basis reaches 0.1% error with 256 runs. So the number of inputs alone does not decide difficulty; the roughness of the response matters as much.</w:t>
       </w:r>
     </w:p>
     <w:p>
@@ -2197,7 +2248,7 @@
         <w:rPr>
           <w:sz w:val="20"/>
         </w:rPr>
-        <w:t xml:space="preserve">With a broad source (heat2d_L1) the best reduced-basis model needs about 64 runs to reach 1% error and 256 for 0.1%; the direct networks need about 128 for 1% and never reach 0.1% in our study. With a narrow moving source (heat2d_L2) neither reaches 1% error by 1,024 runs, and the networks are ahead of the POD-based GP by a small margin. But the error of the POD model equals the projection error of its 32 modes, so a full-field GP is a better choice there. This is the type of problem where the form of the stand-in matters more than the regressor on top of it.</w:t>
+        <w:t xml:space="preserve">With a broad source (heat2d_L1) the best reduced-basis model needs about 64 runs to reach 1% error and 256 for 0.1%; the direct networks need about 128 for 1% and never reach 0.1% in our study. With a narrow moving source (heat2d_L2) neither reaches 1% error by 1,024 runs, and the networks are ahead of the POD-based GP by about a factor of two. But the error of the POD model equals the projection error of its 32 modes, so a full-field GP is a better choice there. This is the type of problem where the form of the stand-in matters more than the regressor on top of it.</w:t>
       </w:r>
     </w:p>
     <w:p>
@@ -2275,7 +2326,7 @@
         <w:rPr>
           <w:sz w:val="20"/>
         </w:rPr>
-        <w:t xml:space="preserve">On smooth problems with up to about four inputs it was usually the most accurate option, and it needs no long training. Give its regularisation a wide search range. (Strong for p ≤ 4 on our problems; unresolved for p ≥ 10.)</w:t>
+        <w:t xml:space="preserve">On problems with up to four inputs the reduced basis was clearly better in 20 of 30 cases at 1,024 runs (networks in 8), and a GP needs no long training. Give its regularisation a wide search range. (Moderate for p ≤ 4 on our problems; unresolved for many inputs.)</w:t>
       </w:r>
     </w:p>
     <w:p>
@@ -2333,7 +2384,7 @@
         <w:rPr>
           <w:sz w:val="20"/>
         </w:rPr>
-        <w:t xml:space="preserve">If the error of your stand-in equals the error of projecting the test data onto the same number of modes, a larger basis or a model without a basis will help more than a better regressor. (Strong; seen on three problems.)</w:t>
+        <w:t xml:space="preserve">If the error of your stand-in equals the error of projecting the test data onto the same number of modes, a larger basis or a model without a basis will help more than a better regressor. (Illustrative: three problems.)</w:t>
       </w:r>
     </w:p>
     <w:p>
@@ -2391,7 +2442,7 @@
         <w:rPr>
           <w:sz w:val="20"/>
         </w:rPr>
-        <w:t xml:space="preserve">Training longer, in double precision and with a polishing step, improved most networks and changed the outcome on about a third of our cases. Do not conclude that a network cannot do better from a single 1,500-epoch run. (Strong.)</w:t>
+        <w:t xml:space="preserve">Training longer, in double precision and with a polishing step, improved most networks and, in the longer-training experiment, changed the outcome on about a third of the cases we retrained. Do not conclude that a network cannot do better from a single 1,500-epoch run. (Strong.)</w:t>
       </w:r>
     </w:p>
     <w:p>
@@ -2502,7 +2553,7 @@
         <w:rPr>
           <w:sz w:val="20"/>
         </w:rPr>
-        <w:t xml:space="preserve">All our problems are simulated stand-ins, solved by our own code, on modest grids and with 3 to 32 inputs. We did not use field or industrial data, so the conclusions say how methods compare on these kinds of problems, not how they will perform on a particular application. The neural networks were only lightly tuned (eight random draws, one training recipe, shared draws across problems), and the 1,024-run results are affected by the doubling of the training steps. Better-tuned networks, other architectures such as Fourier neural operators, or very large budgets could change the picture; the evidence here favours the GP route for smooth low-dimensional problems and says little about problems with many inputs. Most of our statistical evidence is descriptive: we have 24 main problems in 12 families, the cases within a family are not independent, and several of the follow-up experiments were designed after we had seen earlier results. Parts of the supporting analysis, including the audits, were done with the help of AI agents rather than human reviewers.</w:t>
+        <w:t xml:space="preserve">All our problems are simulated stand-ins, solved by our own code, on modest grids and with 3 to 32 inputs. We did not use field or industrial data, so the conclusions say how methods compare on these kinds of problems, not how they will perform on a particular application. The neural networks were only lightly tuned (eight random draws, one training recipe, shared draws across problems), and the 1,024-run results are affected by the doubling of the training steps. Better-tuned networks, other architectures such as Fourier neural operators, or very large budgets could change the picture; the evidence here favours the GP route for smooth low-dimensional problems and says little about problems with many inputs. Most of our statistical evidence is descriptive: we have 24 main problems in 12 families, the cases within a family are not independent, and several of the follow-up experiments were designed after we had seen earlier results. Our literature search was limited (mostly abstracts and bibliographic records), so the related work may be incomplete. The audits and reviews of our drafts were done by AI agents rather than human reviewers.</w:t>
       </w:r>
     </w:p>
     <w:bookmarkEnd w:id="38"/>

</xml_diff>

<commit_message>
v4 second revision after round-2 review; round-2 triage
Co-Authored-By: Claude Sonnet 5.5 <noreply@anthropic.com>
Claude-Session: https://claude.ai/code/session_017fdFnBNWwmmqUrWFrpu4HP
</commit_message>
<xml_diff>
--- a/Reinforced_Research_Project/manuscript/Final_Manuscript_v4.docx
+++ b/Reinforced_Research_Project/manuscript/Final_Manuscript_v4.docx
@@ -24,7 +24,7 @@
           <w:i/>
           <w:sz w:val="20"/>
         </w:rPr>
-        <w:t xml:space="preserve">A comparison of Gaussian-process and neural-network stand-in models on 36 simulated test problems modelled on six application types</w:t>
+        <w:t xml:space="preserve">A comparison of Gaussian-process and neural-network stand-in models on 36 simulated benchmark problems</w:t>
       </w:r>
     </w:p>
     <w:p>
@@ -98,7 +98,7 @@
         <w:rPr>
           <w:sz w:val="20"/>
         </w:rPr>
-        <w:t xml:space="preserve">Engineers often need to run the same slow physics simulation hundreds of times, for design, calibration or uncertainty studies. A common shortcut is to run it a limited number of times and train a fast stand-in model, called a surrogate, on the results. This paper asks a practical question: with a budget of 32 to 1,024 simulation runs, should you build the stand-in from a Gaussian process (GP) working on a reduced basis, or train a neural network? We compared five such models on 36 simulated problems modelled on six types of application (flow through rock, heat conduction, pollutant transport, thermal runaway, spreading fronts, and waves). On smooth problems with few inputs, the reduced-basis GP was far more accurate, sometimes by two or three orders of magnitude, and the reduced-basis family reached 0.1% error on 19 of the 36 problems within the budget, against 10 for the networks (11 against 5 if the eight smooth problems added later are left out). For rough accuracy targets (10% or 1%) the two families were about equally good. Several of the neural networks’ apparent wins came from the limits of the reduced basis rather than of the GP, and disappeared when the GP was applied to the full field. The GP’s edge was not caused by the reduced basis; it came mainly from searching its hyper-parameters over a wide range, since kernel ridge with a wide hyper-parameter search came within a median factor of 6.5 of it with the same number of tuning trials, and about 3 with four times as many. Results shifted noticeably when the networks were trained longer, so we give a short checklist for fair comparisons. Most of our original hypotheses, including that a quick pilot check on 32 runs predicts the winner, were not confirmed. All problems are simulated and the networks were only lightly tuned.</w:t>
+        <w:t xml:space="preserve">Engineers often need to run the same slow physics simulation hundreds of times, for design, calibration or uncertainty studies. A common shortcut is to run it a limited number of times and train a fast stand-in model, called a surrogate, on the results. This paper asks a practical question: with a budget of 32 to 1,024 simulation runs, should you build the stand-in from a Gaussian process (GP) working on a reduced basis, or train a neural network? We compared five such models on 36 simulated benchmark problems from six classes named after application areas (flow through rock, heat conduction, pollutant transport, thermal runaway, spreading fronts, and waves). On smooth problems with few inputs, the reduced-basis GP was far more accurate, sometimes by two or three orders of magnitude, and the reduced-basis family reached 0.1% error on 19 of the 36 problems within the budget, against 10 for the networks (11 against 5 if the eight smooth problems added later are left out). For rough accuracy targets (10% or 1%) the two families were about equally good. Some of the networks’ wins came from the limits of the reduced basis, not of the GP: a GP fitted to the full output field beat them again. A plain kernel-ridge model, once its regularisation was searched over a wide range, closed most of the gap to the GP (from a median 13 times worse to 6.5 times worse with the same eight tuning trials, and 2.7 times worse with 32 trials), so much of the GP’s advantage reflects careful tuning of a smooth regressor, and a residual factor of 2 to 3 remains unexplained. Results shifted noticeably when the networks were trained longer, so we give a short checklist for fair comparisons. Most of our original hypotheses, including that a quick pilot check on 32 runs predicts the winner, were not confirmed. All problems are simulated and the networks were only lightly tuned.</w:t>
       </w:r>
     </w:p>
     <w:p>
@@ -195,7 +195,7 @@
         <w:rPr>
           <w:sz w:val="20"/>
         </w:rPr>
-        <w:t xml:space="preserve">What a practitioner still lacks is a quantitative picture. How big is the difference, on which kinds of problems, at which budget? Why does one side win? Is there a cheap way to tell in advance? And how much do the comparison’s own settings, such as how long the network is trained, change the answer? We tried to answer these questions with a controlled comparison on 36 simulated problems modelled on six types of application. We compared five stand-in models under the same tuning procedure, measured how many simulation runs each needs to reach a given accuracy, and ran extra experiments to find out</w:t>
+        <w:t xml:space="preserve">What a practitioner still lacks is a quantitative picture. How big is the difference, on which kinds of problems, at which budget? Why does one side win? Is there a cheap way to tell in advance? And how much do the comparison’s own settings, such as how long the network is trained, change the answer? We tried to answer these questions with a controlled comparison on 36 simulated benchmark problems from six classes named after application areas. We compared five stand-in models under the same tuning procedure, measured how many simulation runs each needs to reach a given accuracy, and ran extra experiments to find out</w:t>
       </w:r>
       <w:r>
         <w:rPr>
@@ -232,7 +232,7 @@
         <w:rPr>
           <w:sz w:val="20"/>
         </w:rPr>
-        <w:t xml:space="preserve">In brief, the Gaussian-process stand-ins were far more accurate than lightly tuned neural networks on smooth problems with a few inputs, and neither side had a consistent advantage on the rest. A good part of the networks’ apparent wins on harder problems came from the limits of the reduced basis rather than from the GP, and the GP’s advantage came mostly from how widely and carefully its settings were searched. The outcome also moved when we trained the networks longer. We built the paper around a practical checklist (Section 6) that follows from these findings.</w:t>
+        <w:t xml:space="preserve">Our results confirm earlier reports that Gaussian-process and kernel methods are hard to beat on smooth problems; what we add is a quantified picture across budgets and problem types, controls that show where the advantage comes from, and a record of how much the answer moves with the comparison’s own settings. In brief, the Gaussian-process stand-ins were far more accurate than lightly tuned neural networks on smooth problems with a few inputs, and neither side had a consistent advantage on the rest. A good part of the networks’ apparent wins on harder problems came from the limits of the reduced basis rather than from the GP, and the GP’s advantage came mostly from how widely and carefully its settings were searched. The outcome also moved when we trained the networks longer. We built the paper around a practical checklist (Section 6) that follows from these findings.</w:t>
       </w:r>
     </w:p>
     <w:bookmarkEnd w:id="21"/>
@@ -482,7 +482,7 @@
         <w:rPr>
           <w:sz w:val="20"/>
         </w:rPr>
-        <w:t xml:space="preserve">Real simulation datasets with known accuracy are hard to share and verify, so we used our own simulators, each checked against exact or manufactured solutions or by grid refinement. The 36 problems fall into six application types (Table 1).</w:t>
+        <w:t xml:space="preserve">Real simulation datasets with known accuracy are hard to share and verify, so we used our own simulators, each checked against exact or manufactured solutions or by grid refinement. The 36 problems fall into six classes named after application areas (Table 1). The classes are our own groupings of standard PDE benchmark families;</w:t>
       </w:r>
       <w:r>
         <w:rPr>
@@ -496,13 +496,13 @@
           <w:b/>
           <w:sz w:val="20"/>
         </w:rPr>
-        <w:t xml:space="preserve">They are stand-ins modelled on these applications, not field or industrial data</w:t>
-      </w:r>
-      <w:r>
-        <w:rPr>
-          <w:sz w:val="20"/>
-        </w:rPr>
-        <w:t xml:space="preserve">; the point is to cover the range of behaviour (smooth or sharp, few or many inputs, steady or moving features) that practitioners meet. Each application type has two or more problems, often a gentle and a harder version.</w:t>
+        <w:t xml:space="preserve">nothing here was calibrated to a real application, and no field or industrial data were used</w:t>
+      </w:r>
+      <w:r>
+        <w:rPr>
+          <w:sz w:val="20"/>
+        </w:rPr>
+        <w:t xml:space="preserve">; the point is to cover the range of behaviour (smooth or sharp, few or many inputs, steady or moving features) that practitioners meet. Each class has two or more problems, often a gentle and a harder version.</w:t>
       </w:r>
     </w:p>
     <w:tbl>
@@ -542,7 +542,7 @@
               <w:rPr>
                 <w:sz w:val="15"/>
               </w:rPr>
-              <w:t xml:space="preserve">Application type</w:t>
+              <w:t xml:space="preserve">Problem class (application area)</w:t>
             </w:r>
           </w:p>
         </w:tc>
@@ -1284,7 +1284,7 @@
           <w:i/>
           <w:sz w:val="20"/>
         </w:rPr>
-        <w:t xml:space="preserve">Table 1. The 36 test problems by application type. The last two columns are medians over the problems of each type at 1,024 training runs: the log₁₀ error ratio (positive: the reduced-basis group is better) and the typical test error of each group.</w:t>
+        <w:t xml:space="preserve">Table 1. The 36 test problems by class (all 36 are counted here, whereas Figure 1 and the text use the 24 main problems). The last three columns refer to 1,024 training runs; the log₁₀ error ratio is a median over the problems of each class: the log₁₀ error ratio (positive: the reduced-basis group is better) and the typical test error of each group.</w:t>
       </w:r>
     </w:p>
     <w:p>
@@ -1331,37 +1331,7 @@
         <w:rPr>
           <w:sz w:val="20"/>
         </w:rPr>
-        <w:t xml:space="preserve">The answer depends heavily on the budget and the problem type (Figure 1, Table 1). With very few runs (32) the two groups are mostly tied: of the 24 main problems, 5 favour the reduced-basis group, 5 the networks, and 14 are ties. With 1,024 runs the reduced-basis group is clearly better on 13 problems, the networks on 8, and 3 are ties (the number of network wins is 6 if the tie band is widened to 0.15 and 10 if it is narrowed to 0.05). Earlier we had read the small-budget results as</w:t>
-      </w:r>
-      <w:r>
-        <w:rPr>
-          <w:sz w:val="20"/>
-        </w:rPr>
-        <w:t xml:space="preserve"> </w:t>
-      </w:r>
-      <w:r>
-        <w:rPr>
-          <w:sz w:val="20"/>
-        </w:rPr>
-        <w:t xml:space="preserve">“</w:t>
-      </w:r>
-      <w:r>
-        <w:rPr>
-          <w:sz w:val="20"/>
-        </w:rPr>
-        <w:t xml:space="preserve">networks win most cases</w:t>
-      </w:r>
-      <w:r>
-        <w:rPr>
-          <w:sz w:val="20"/>
-        </w:rPr>
-        <w:t xml:space="preserve">”</w:t>
-      </w:r>
-      <w:r>
-        <w:rPr>
-          <w:sz w:val="20"/>
-        </w:rPr>
-        <w:t xml:space="preserve">, but most of those were ties. In fact most of our original pre-registered hypotheses were not supported: networks did not win at small budgets, the gap did not shrink steadily as the budget grew, and the pilot check described in Section 4.4 did not predict the winner (three of four hypotheses failed; details in the Supplement).</w:t>
+        <w:t xml:space="preserve">The answer depends heavily on the budget and the problem type (Figure 1, Table 1). With very few runs (32) the two groups are mostly tied: of the 24 main problems, 5 favour the reduced-basis group, 5 the networks, and 14 are ties. With 1,024 runs the reduced-basis group is clearly better on 13 problems, the networks on 8, and 3 are ties (the number of network wins is 6 if the tie band is widened to 0.15 and 10 if it is narrowed to 0.05). At 32 runs, 14 of the 24 problems are ties, so no family is clearly ahead; counting small differences as wins would make the networks look better than they are. Most of our original pre-registered hypotheses were not supported: networks did not win at small budgets, the gap did not shrink steadily as the budget grew, and the pilot check described in Section 4.4 did not predict the winner (three of four hypotheses failed; details in the Supplement).</w:t>
       </w:r>
     </w:p>
     <w:p>
@@ -1499,7 +1469,7 @@
         <w:rPr>
           <w:sz w:val="20"/>
         </w:rPr>
-        <w:t xml:space="preserve">By application type, reduced-basis models were ahead on most heat-conduction and reaction problems, on the thermal-runaway problems and on the simple porous-flow problems. The networks led on a few problems with sharp moving features (transport_L2, kdv_L1) and on the porous-flow problems with a moving inclusion or many inputs (incl_L1, incl_L2, darcy_L2, darcyhd_L1); as Section 4.3 shows, a full-field GP often reverses the inclusion cases. For the many-input problems the picture is mixed. On the two porous-flow problems with 16 and 32 uncertain inputs and a rough permeability field (darcyhd) the networks were ahead by about a third, but not consistently across seeds, and on the 10-input version (darcy_L2) they were ahead by about 50%; on the two nearly linear problems with 16 and 32 inputs (darcylin) the reduced basis was ahead (factors of 3 and 1.5). We therefore cannot say which family is better when the inputs are many.</w:t>
+        <w:t xml:space="preserve">By problem class, reduced-basis models were ahead on most heat-conduction and reaction problems, on the thermal-runaway problems and on the simple porous-flow problems. The networks led on a few problems with sharp moving features (transport_L2, kdv_L1) and on the porous-flow problems with a moving inclusion or many inputs (incl_L1, incl_L2, darcy_L2, darcyhd_L1); as Section 4.3 shows, a full-field GP often reverses the inclusion cases. For the many-input problems the picture is mixed. On the two porous-flow problems with 16 and 32 uncertain inputs and a rough permeability field (darcyhd) the networks were ahead by about a third, but not consistently across seeds, and on the 10-input version (darcy_L2) they were ahead by about 50%; on the two nearly linear problems with 16 and 32 inputs (darcylin) the reduced basis was ahead (factors of 3 and 1.5). We therefore cannot say which family is better when the inputs are many.</w:t>
       </w:r>
     </w:p>
     <w:bookmarkEnd w:id="27"/>
@@ -1825,7 +1795,7 @@
         <w:rPr>
           <w:sz w:val="20"/>
         </w:rPr>
-        <w:t xml:space="preserve">Training time is a minor cost compared with the simulations themselves but is not negligible. At 1,024 runs, tuning and fitting took a median of about 44 seconds of CPU time for the GP model, 86 for the POD+network, 116–139 for the direct networks, and a third of a second for the polynomial.</w:t>
+        <w:t xml:space="preserve">Training time is a minor cost compared with the simulations themselves but is not negligible. At 1,024 runs, tuning and fitting took a median of about 44 seconds of CPU time for the GP model, 86 for the POD+network, 116–139 for the direct networks, and about 0.3 seconds for the polynomial (each fit used one CPU thread; the software versions are recorded in the repository). We did not account for the cost of using the trained model, nor compare with the cost of the simulations themselves.</w:t>
       </w:r>
     </w:p>
     <w:bookmarkEnd w:id="28"/>
@@ -1874,7 +1844,7 @@
         <w:rPr>
           <w:sz w:val="20"/>
         </w:rPr>
-        <w:t xml:space="preserve">A Gaussian process applied directly to the full output field, without any POD, was as accurate as the reduced-basis GP where the latter did well (median error ratio 0.95). Where networks had beaten the POD-based GP, the full-field GP often beat the networks again. On the heat problem with a narrow moving source (heat2d_L2) and the two inclusion problems (incl_L1, incl_L2), the error of the POD+GP model is the same as the error of the POD projection with 32 modes (0.055, 0.0020 and 0.0046 against 0.054, 0.0020 and 0.0042), so POD itself is the bottleneck and the networks, which are not confined to a basis, get below it. When we ran the full-field GP on the two moving-feature problems added later, it beat the best network by 1.2 and 1.0 orders of magnitude at 1,024 runs, where the POD+GP had lost to the networks.</w:t>
+        <w:t xml:space="preserve">A Gaussian process applied directly to the full output field, without any POD, was as accurate as the reduced-basis GP where the latter did well (median error ratio 0.95). Where networks had beaten the POD-based GP, the full-field GP often beat the networks again. On the heat problem with a narrow moving source (heat2d_L2) and the two inclusion problems (incl_L1, incl_L2), the POD+GP error (5.5e-02, 2.0e-03 and 4.6e-03) is essentially the best error any 32-mode basis could reach even with perfect weights (5.4e-02, 2.0e-03 and 4.2e-03). The basis, not the regressor, sets the limit. Networks that produce the whole field are not tied to a basis and can get below it. When we ran the full-field GP on the two moving-feature problems added later, it beat the best network by 1.2 and 1.0 orders of magnitude at 1,024 runs, where the POD+GP had lost to the networks.</w:t>
       </w:r>
     </w:p>
     <w:p>
@@ -1899,7 +1869,7 @@
         <w:rPr>
           <w:sz w:val="20"/>
         </w:rPr>
-        <w:t xml:space="preserve">Kernel ridge regression is the same kind of model without the Gaussian process’s automatic fitting of its settings. With the narrow range of settings we first gave it, it was a median 13 times less accurate than the GP in the 28 budget-and-problem combinations (budgets 64, 256 and 1,024) where the GP clearly beats the best network. After a review of our draft by an AI agent we had asked to criticise it pointed out that this range could not reach the very small regularisation that near-perfect fits need, we repeated the test with a wide range. On the same 28 combinations the gap shrank to a factor of 6.5 with the same eight tuning trials, and to 2.7 with 32 trials (only 57% of the combinations were within a factor of 3 even then), and the wide-range kernel ridge beat the best neural network clearly in 64% of them. A polynomial, which has no kernel and no automatic fitting at all, was a median 10 times worse than the GP but still clearly beat the best network in 23 of the 52 cells where the GP did. Taken together, the advantage belongs largely to smooth regressors whose regularisation is searched widely and finely, and not to the reduced basis; at equal numbers of tuning trials the Gaussian process was still clearly better than even the wide kernel ridge. We did not isolate the contribution of the GP’s marginal-likelihood fitting, because its cost is not matched by our kernel-ridge search.</w:t>
+        <w:t xml:space="preserve">Kernel ridge regression is the same kind of model without the Gaussian process’s automatic fitting of its settings. With the narrow range of settings we first gave it, it was a median 13 times less accurate than the GP in the 28 budget-and-problem combinations (budgets 64, 256 and 1,024) where the GP clearly beats the best network. After a review of our draft by an AI agent we had asked to criticise it pointed out that this range could not reach the very small regularisation that near-perfect fits need, we repeated the test with a wide range. On the same 28 combinations the gap shrank to a factor of 6.5 with the same eight tuning trials, and to 2.7 with 32 trials (only 57% of the combinations were within a factor of 3 even then), and the wide-range kernel ridge beat the best neural network clearly in 64% of them. A polynomial, which has no kernel and no automatic fitting at all, was a median 10 times worse than the GP but still clearly beat the best network in 23 of the 52 cells (44%) where the GP did. Taken together, the advantage belongs largely to smooth regressors whose regularisation is searched widely and finely, and not to the reduced basis; at equal numbers of tuning trials the Gaussian process was still clearly better than even the wide kernel ridge. We did not isolate the contribution of the GP’s marginal-likelihood fitting, because its cost is not matched by our kernel-ridge search.</w:t>
       </w:r>
     </w:p>
     <w:p>
@@ -1990,7 +1960,7 @@
           <wp:inline>
             <wp:extent cx="3733800" cy="1768642"/>
             <wp:effectExtent b="0" l="0" r="0" t="0"/>
-            <wp:docPr descr="Figure 2. How much worse each alternative is than the Gaussian-process reduced model, on problems where that model clearly beats the best neural network. Each dot is one problem and budget; the dashed line marks a factor of 3. From the left: kernel ridge with a narrow search range (52 combinations, all budgets), kernel ridge with a wide search range and 8 tuning trials, the same with 32 trials, a Gaussian process with one length-scale, and a Gaussian process on the full field without a reduced basis (28 combinations each)." title="" id="30" name="Picture"/>
+            <wp:docPr descr="Figure 2. Ratio of test errors (alternative over the Gaussian-process reduced model; above 1 means the alternative is worse), where that model clearly beats the best neural network. Each dot is one problem and budget; the dashed line marks a factor of 3. From the left: kernel ridge with a narrow search range (52 combinations, all budgets), kernel ridge with a wide search range and 8 tuning trials, the same with 32 trials, a Gaussian process with one length-scale, and a Gaussian process on the full field without a reduced basis (28 combinations each)." title="" id="30" name="Picture"/>
             <a:graphic>
               <a:graphicData uri="http://schemas.openxmlformats.org/drawingml/2006/picture">
                 <pic:pic>
@@ -2050,7 +2020,7 @@
         <w:rPr>
           <w:sz w:val="20"/>
         </w:rPr>
-        <w:t xml:space="preserve">How much worse each alternative is than the Gaussian-process reduced model, on problems where that model clearly beats the best neural network. Each dot is one problem and budget; the dashed line marks a factor of 3. From the left: kernel ridge with a narrow search range (52 combinations, all budgets), kernel ridge with a wide search range and 8 tuning trials, the same with 32 trials, a Gaussian process with one length-scale, and a Gaussian process on the full field without a reduced basis (28 combinations each).</w:t>
+        <w:t xml:space="preserve">Ratio of test errors (alternative over the Gaussian-process reduced model; above 1 means the alternative is worse), where that model clearly beats the best neural network. Each dot is one problem and budget; the dashed line marks a factor of 3. From the left: kernel ridge with a narrow search range (52 combinations, all budgets), kernel ridge with a wide search range and 8 tuning trials, the same with 32 trials, a Gaussian process with one length-scale, and a Gaussian process on the full field without a reduced basis (28 combinations each).</w:t>
       </w:r>
     </w:p>
     <w:bookmarkEnd w:id="32"/>
@@ -2074,7 +2044,7 @@
         <w:rPr>
           <w:sz w:val="20"/>
         </w:rPr>
-        <w:t xml:space="preserve">It would be convenient to run 32 simulations, look at how quickly POD compresses them, and decide. We froze such a rule from the original data and tested it on eight new problems. It did not work convincingly: the correlation was in the expected direction but not significant (ρ = -0.38, p = 0.180) and the rule’s gain over a baseline was borderline (p = 0.051 after correction). Most of that borderline gain came from two nonlinear-heat problems, and without them the correlation changes sign. The pilot statistic also tracks the number of inputs: it is strongly negative only on three-input problems. Follow-up experiments agreed with a simple reading: smooth problems with few inputs favour the GP by a lot, and a pilot statistic mostly detects that. We would not rely on it beyond an informal check of smoothness and dimension. Full details are in the Supplement.</w:t>
+        <w:t xml:space="preserve">It would be convenient to run 32 simulations, look at how quickly POD compresses them, and decide. We froze such a rule from the original data and tested it on eight new problems. It did not work convincingly: the correlation was in the expected direction but not significant (ρ = -0.38, p = 0.180) and the rule’s gain over a baseline was borderline (p = 0.051 after correction). Most of that borderline gain came from two nonlinear-heat problems, and without them the correlation changes sign. The pilot statistic also tracks the number of inputs: it is strongly negative only on three-input problems. Two follow-up sets of problems (eight smooth candidates and four probes designed to separate the pilot statistic from the number of inputs) agreed with a simple reading: smooth problems with few inputs favour the GP by a lot, and a pilot statistic mostly detects that. We would not rely on it beyond an informal check of smoothness and dimension. Full details are in the Supplement.</w:t>
       </w:r>
     </w:p>
     <w:bookmarkEnd w:id="33"/>
@@ -2123,7 +2093,7 @@
         <w:rPr>
           <w:sz w:val="20"/>
         </w:rPr>
-        <w:t xml:space="preserve">Retraining the stored best networks for four times as many epochs improved nine in ten of them and moved the comparison toward the networks in all 15 of the 48 (problem, budget) cases whose classification changed; 9 ties became network wins. Double precision and a second-order polish lowered the networks’ error by a further half decade on average. (This comparison again uses the best network by test error.) The largest gaps survived: on 5 of the 7 problems where the reduced basis led by a factor of 10 or more, it still did after the stronger training, and on the other two (darcy_L1 and heat2d_L1) it led by factors of about 4 and 9. The networks’ error also stayed around 2·10⁻⁴ at best, far above the best GP errors of 10⁻⁷ to 10⁻⁵, which suggests training limits rather than a lack of capacity; but we did not explore every way of tuning a network, and a thoroughly tuned network could do better.</w:t>
+        <w:t xml:space="preserve">Retraining the stored best networks for four times as many epochs improved nine in ten of them and moved the comparison toward the networks in all 15 of the 48 (problem, budget) cases whose classification changed; 9 ties became network wins. Double precision and a second-order optimiser (L-BFGS) lowered the networks’ error by a further half decade (median, over the problems tested). (This comparison again uses the best network by test error.) The largest gaps survived: on 5 of the 7 problems where the reduced basis led by a factor of 10 or more, it still did after the stronger training, and on the other two (darcy_L1 and heat2d_L1) it led by factors of about 4 and 9. The networks’ error still did not fall below about 2·10⁻⁴, far above the best GP errors of 10⁻⁷ to 10⁻⁵. We do not know why the networks plateau there, and a better-tuned network may do better.</w:t>
       </w:r>
     </w:p>
     <w:p>
@@ -2223,7 +2193,7 @@
         <w:rPr>
           <w:sz w:val="20"/>
         </w:rPr>
-        <w:t xml:space="preserve">The simple version has 4 inputs. With 256 runs the reduced-basis group reaches a mean error of 3.2e-04 and the best network 4.2e-03; with 1,024 runs the figures are 1.5e-04 and 2.1e-03. If 1% error is enough, either approach works from about 64 runs. With 16 inputs and a rough permeability field (darcyhd_L1) both groups are stuck at an error of about 4–6% even with 1,024 runs (reduced basis 5.8e-02, best network 4.3e-02). A smoother problem with the same number of inputs (darcylin_L1) is easy: the reduced basis reaches 0.1% error with 256 runs. So the number of inputs alone does not decide difficulty; the roughness of the response matters as much.</w:t>
+        <w:t xml:space="preserve">The simple version has 4 inputs. With 256 runs the reduced-basis group reaches a mean error of 3.2e-04 and the best network 4.2e-03; with 1,024 runs the figures are 1.5e-04 and 2.1e-03. If 1% error is enough, either approach works from about 64 runs. With 16 inputs and a rough permeability field (darcyhd_L1) both groups are stuck at an error of about 4–6% even with 1,024 runs (reduced basis 5.8e-02, best network 4.3e-02: the network is about 25% lower, just outside our tie band). A smoother problem with the same number of inputs (darcylin_L1) is easy: the reduced basis reaches 0.1% error with 256 runs. So the number of inputs alone does not decide difficulty; the roughness of the response matters as much.</w:t>
       </w:r>
     </w:p>
     <w:p>
@@ -2292,6 +2262,478 @@
     <w:p>
       <w:pPr>
         <w:pStyle w:val="FirstParagraph"/>
+      </w:pPr>
+      <w:r>
+        <w:rPr>
+          <w:sz w:val="20"/>
+        </w:rPr>
+        <w:t xml:space="preserve">Table 3 summarises how the two groups compared by number of inputs at 1,024 runs, our best attempt at a decision aid; the counts are small, so treat it as a rough guide.</w:t>
+      </w:r>
+    </w:p>
+    <w:tbl>
+      <w:tblPr>
+        <w:tblStyle w:val="Table"/>
+        <w:tblW w:type="pct" w:w="5000"/>
+        <w:jc w:val="center"/>
+        <w:tblLayout w:type="fixed"/>
+        <w:tblLook w:firstRow="1" w:lastRow="0" w:firstColumn="0" w:lastColumn="0" w:noHBand="0" w:noVBand="0" w:val="0020"/>
+        <w:tblLayout w:type="fixed"/>
+      </w:tblPr>
+      <w:tblGrid>
+        <w:gridCol w:w="996"/>
+        <w:gridCol w:w="1195"/>
+        <w:gridCol w:w="348"/>
+        <w:gridCol w:w="896"/>
+        <w:gridCol w:w="4483"/>
+      </w:tblGrid>
+      <w:tr>
+        <w:trPr>
+          <w:tblHeader w:val="true"/>
+        </w:trPr>
+        <w:tc>
+          <w:tcPr>
+            <w:tcW w:type="dxa" w:w="1580"/>
+            <w:tcBorders>
+              <w:top w:val="single" w:sz="4" w:color="BBBBBB"/>
+              <w:bottom w:val="single" w:sz="4" w:color="BBBBBB"/>
+            </w:tcBorders>
+          </w:tcPr>
+          <w:p>
+            <w:pPr>
+              <w:pStyle w:val="Compact"/>
+              <w:jc w:val="left"/>
+            </w:pPr>
+            <w:r>
+              <w:rPr>
+                <w:sz w:val="15"/>
+              </w:rPr>
+              <w:t xml:space="preserve">Number of inputs</w:t>
+            </w:r>
+          </w:p>
+        </w:tc>
+        <w:tc>
+          <w:tcPr>
+            <w:tcW w:type="dxa" w:w="1580"/>
+            <w:tcBorders>
+              <w:top w:val="single" w:sz="4" w:color="BBBBBB"/>
+              <w:bottom w:val="single" w:sz="4" w:color="BBBBBB"/>
+            </w:tcBorders>
+          </w:tcPr>
+          <w:p>
+            <w:pPr>
+              <w:pStyle w:val="Compact"/>
+              <w:jc w:val="right"/>
+            </w:pPr>
+            <w:r>
+              <w:rPr>
+                <w:sz w:val="15"/>
+              </w:rPr>
+              <w:t xml:space="preserve">Reduced basis better</w:t>
+            </w:r>
+          </w:p>
+        </w:tc>
+        <w:tc>
+          <w:tcPr>
+            <w:tcW w:type="dxa" w:w="1580"/>
+            <w:tcBorders>
+              <w:top w:val="single" w:sz="4" w:color="BBBBBB"/>
+              <w:bottom w:val="single" w:sz="4" w:color="BBBBBB"/>
+            </w:tcBorders>
+          </w:tcPr>
+          <w:p>
+            <w:pPr>
+              <w:pStyle w:val="Compact"/>
+              <w:jc w:val="right"/>
+            </w:pPr>
+            <w:r>
+              <w:rPr>
+                <w:sz w:val="15"/>
+              </w:rPr>
+              <w:t xml:space="preserve">Tie</w:t>
+            </w:r>
+          </w:p>
+        </w:tc>
+        <w:tc>
+          <w:tcPr>
+            <w:tcW w:type="dxa" w:w="1580"/>
+            <w:tcBorders>
+              <w:top w:val="single" w:sz="4" w:color="BBBBBB"/>
+              <w:bottom w:val="single" w:sz="4" w:color="BBBBBB"/>
+            </w:tcBorders>
+          </w:tcPr>
+          <w:p>
+            <w:pPr>
+              <w:pStyle w:val="Compact"/>
+              <w:jc w:val="right"/>
+            </w:pPr>
+            <w:r>
+              <w:rPr>
+                <w:sz w:val="15"/>
+              </w:rPr>
+              <w:t xml:space="preserve">Network better</w:t>
+            </w:r>
+          </w:p>
+        </w:tc>
+        <w:tc>
+          <w:tcPr>
+            <w:tcW w:type="dxa" w:w="3318"/>
+            <w:tcBorders>
+              <w:top w:val="single" w:sz="4" w:color="BBBBBB"/>
+              <w:bottom w:val="single" w:sz="4" w:color="BBBBBB"/>
+            </w:tcBorders>
+          </w:tcPr>
+          <w:p>
+            <w:pPr>
+              <w:pStyle w:val="Compact"/>
+              <w:jc w:val="left"/>
+            </w:pPr>
+            <w:r>
+              <w:rPr>
+                <w:sz w:val="15"/>
+              </w:rPr>
+              <w:t xml:space="preserve">What our results suggest</w:t>
+            </w:r>
+          </w:p>
+        </w:tc>
+      </w:tr>
+      <w:tr>
+        <w:tc>
+          <w:tcPr>
+            <w:tcW w:type="dxa" w:w="1580"/>
+            <w:tcBorders>
+              <w:top w:val="single" w:sz="4" w:color="BBBBBB"/>
+              <w:bottom w:val="single" w:sz="4" w:color="BBBBBB"/>
+            </w:tcBorders>
+          </w:tcPr>
+          <w:p>
+            <w:pPr>
+              <w:pStyle w:val="Compact"/>
+              <w:jc w:val="left"/>
+            </w:pPr>
+            <w:r>
+              <w:rPr>
+                <w:sz w:val="15"/>
+              </w:rPr>
+              <w:t xml:space="preserve">4 or fewer</w:t>
+            </w:r>
+          </w:p>
+        </w:tc>
+        <w:tc>
+          <w:tcPr>
+            <w:tcW w:type="dxa" w:w="1580"/>
+            <w:tcBorders>
+              <w:top w:val="single" w:sz="4" w:color="BBBBBB"/>
+              <w:bottom w:val="single" w:sz="4" w:color="BBBBBB"/>
+            </w:tcBorders>
+          </w:tcPr>
+          <w:p>
+            <w:pPr>
+              <w:pStyle w:val="Compact"/>
+              <w:jc w:val="right"/>
+            </w:pPr>
+            <w:r>
+              <w:rPr>
+                <w:sz w:val="15"/>
+              </w:rPr>
+              <w:t xml:space="preserve">20</w:t>
+            </w:r>
+          </w:p>
+        </w:tc>
+        <w:tc>
+          <w:tcPr>
+            <w:tcW w:type="dxa" w:w="1580"/>
+            <w:tcBorders>
+              <w:top w:val="single" w:sz="4" w:color="BBBBBB"/>
+              <w:bottom w:val="single" w:sz="4" w:color="BBBBBB"/>
+            </w:tcBorders>
+          </w:tcPr>
+          <w:p>
+            <w:pPr>
+              <w:pStyle w:val="Compact"/>
+              <w:jc w:val="right"/>
+            </w:pPr>
+            <w:r>
+              <w:rPr>
+                <w:sz w:val="15"/>
+              </w:rPr>
+              <w:t xml:space="preserve">2</w:t>
+            </w:r>
+          </w:p>
+        </w:tc>
+        <w:tc>
+          <w:tcPr>
+            <w:tcW w:type="dxa" w:w="1580"/>
+            <w:tcBorders>
+              <w:top w:val="single" w:sz="4" w:color="BBBBBB"/>
+              <w:bottom w:val="single" w:sz="4" w:color="BBBBBB"/>
+            </w:tcBorders>
+          </w:tcPr>
+          <w:p>
+            <w:pPr>
+              <w:pStyle w:val="Compact"/>
+              <w:jc w:val="right"/>
+            </w:pPr>
+            <w:r>
+              <w:rPr>
+                <w:sz w:val="15"/>
+              </w:rPr>
+              <w:t xml:space="preserve">8</w:t>
+            </w:r>
+          </w:p>
+        </w:tc>
+        <w:tc>
+          <w:tcPr>
+            <w:tcW w:type="dxa" w:w="3318"/>
+            <w:tcBorders>
+              <w:top w:val="single" w:sz="4" w:color="BBBBBB"/>
+              <w:bottom w:val="single" w:sz="4" w:color="BBBBBB"/>
+            </w:tcBorders>
+          </w:tcPr>
+          <w:p>
+            <w:pPr>
+              <w:pStyle w:val="Compact"/>
+              <w:jc w:val="left"/>
+            </w:pPr>
+            <w:r>
+              <w:rPr>
+                <w:sz w:val="15"/>
+              </w:rPr>
+              <w:t xml:space="preserve">Start with a Gaussian-process or reduced-basis model; add a network only if you need to.</w:t>
+            </w:r>
+          </w:p>
+        </w:tc>
+      </w:tr>
+      <w:tr>
+        <w:tc>
+          <w:tcPr>
+            <w:tcW w:type="dxa" w:w="1580"/>
+            <w:tcBorders>
+              <w:top w:val="single" w:sz="4" w:color="BBBBBB"/>
+              <w:bottom w:val="single" w:sz="4" w:color="BBBBBB"/>
+            </w:tcBorders>
+          </w:tcPr>
+          <w:p>
+            <w:pPr>
+              <w:pStyle w:val="Compact"/>
+              <w:jc w:val="left"/>
+            </w:pPr>
+            <w:r>
+              <w:rPr>
+                <w:sz w:val="15"/>
+              </w:rPr>
+              <w:t xml:space="preserve">5 to 9</w:t>
+            </w:r>
+          </w:p>
+        </w:tc>
+        <w:tc>
+          <w:tcPr>
+            <w:tcW w:type="dxa" w:w="1580"/>
+            <w:tcBorders>
+              <w:top w:val="single" w:sz="4" w:color="BBBBBB"/>
+              <w:bottom w:val="single" w:sz="4" w:color="BBBBBB"/>
+            </w:tcBorders>
+          </w:tcPr>
+          <w:p>
+            <w:pPr>
+              <w:pStyle w:val="Compact"/>
+              <w:jc w:val="right"/>
+            </w:pPr>
+            <w:r>
+              <w:rPr>
+                <w:sz w:val="15"/>
+              </w:rPr>
+              <w:t xml:space="preserve">1</w:t>
+            </w:r>
+          </w:p>
+        </w:tc>
+        <w:tc>
+          <w:tcPr>
+            <w:tcW w:type="dxa" w:w="1580"/>
+            <w:tcBorders>
+              <w:top w:val="single" w:sz="4" w:color="BBBBBB"/>
+              <w:bottom w:val="single" w:sz="4" w:color="BBBBBB"/>
+            </w:tcBorders>
+          </w:tcPr>
+          <w:p>
+            <w:pPr>
+              <w:pStyle w:val="Compact"/>
+              <w:jc w:val="right"/>
+            </w:pPr>
+            <w:r>
+              <w:rPr>
+                <w:sz w:val="15"/>
+              </w:rPr>
+              <w:t xml:space="preserve">0</w:t>
+            </w:r>
+          </w:p>
+        </w:tc>
+        <w:tc>
+          <w:tcPr>
+            <w:tcW w:type="dxa" w:w="1580"/>
+            <w:tcBorders>
+              <w:top w:val="single" w:sz="4" w:color="BBBBBB"/>
+              <w:bottom w:val="single" w:sz="4" w:color="BBBBBB"/>
+            </w:tcBorders>
+          </w:tcPr>
+          <w:p>
+            <w:pPr>
+              <w:pStyle w:val="Compact"/>
+              <w:jc w:val="right"/>
+            </w:pPr>
+            <w:r>
+              <w:rPr>
+                <w:sz w:val="15"/>
+              </w:rPr>
+              <w:t xml:space="preserve">0</w:t>
+            </w:r>
+          </w:p>
+        </w:tc>
+        <w:tc>
+          <w:tcPr>
+            <w:tcW w:type="dxa" w:w="3318"/>
+            <w:tcBorders>
+              <w:top w:val="single" w:sz="4" w:color="BBBBBB"/>
+              <w:bottom w:val="single" w:sz="4" w:color="BBBBBB"/>
+            </w:tcBorders>
+          </w:tcPr>
+          <w:p>
+            <w:pPr>
+              <w:pStyle w:val="Compact"/>
+              <w:jc w:val="left"/>
+            </w:pPr>
+            <w:r>
+              <w:rPr>
+                <w:sz w:val="15"/>
+              </w:rPr>
+              <w:t xml:space="preserve">Too few problems to say; try both.</w:t>
+            </w:r>
+          </w:p>
+        </w:tc>
+      </w:tr>
+      <w:tr>
+        <w:tc>
+          <w:tcPr>
+            <w:tcW w:type="dxa" w:w="1580"/>
+            <w:tcBorders>
+              <w:top w:val="single" w:sz="4" w:color="BBBBBB"/>
+              <w:bottom w:val="single" w:sz="4" w:color="BBBBBB"/>
+            </w:tcBorders>
+          </w:tcPr>
+          <w:p>
+            <w:pPr>
+              <w:pStyle w:val="Compact"/>
+              <w:jc w:val="left"/>
+            </w:pPr>
+            <w:r>
+              <w:rPr>
+                <w:sz w:val="15"/>
+              </w:rPr>
+              <w:t xml:space="preserve">10 or more</w:t>
+            </w:r>
+          </w:p>
+        </w:tc>
+        <w:tc>
+          <w:tcPr>
+            <w:tcW w:type="dxa" w:w="1580"/>
+            <w:tcBorders>
+              <w:top w:val="single" w:sz="4" w:color="BBBBBB"/>
+              <w:bottom w:val="single" w:sz="4" w:color="BBBBBB"/>
+            </w:tcBorders>
+          </w:tcPr>
+          <w:p>
+            <w:pPr>
+              <w:pStyle w:val="Compact"/>
+              <w:jc w:val="right"/>
+            </w:pPr>
+            <w:r>
+              <w:rPr>
+                <w:sz w:val="15"/>
+              </w:rPr>
+              <w:t xml:space="preserve">2</w:t>
+            </w:r>
+          </w:p>
+        </w:tc>
+        <w:tc>
+          <w:tcPr>
+            <w:tcW w:type="dxa" w:w="1580"/>
+            <w:tcBorders>
+              <w:top w:val="single" w:sz="4" w:color="BBBBBB"/>
+              <w:bottom w:val="single" w:sz="4" w:color="BBBBBB"/>
+            </w:tcBorders>
+          </w:tcPr>
+          <w:p>
+            <w:pPr>
+              <w:pStyle w:val="Compact"/>
+              <w:jc w:val="right"/>
+            </w:pPr>
+            <w:r>
+              <w:rPr>
+                <w:sz w:val="15"/>
+              </w:rPr>
+              <w:t xml:space="preserve">1</w:t>
+            </w:r>
+          </w:p>
+        </w:tc>
+        <w:tc>
+          <w:tcPr>
+            <w:tcW w:type="dxa" w:w="1580"/>
+            <w:tcBorders>
+              <w:top w:val="single" w:sz="4" w:color="BBBBBB"/>
+              <w:bottom w:val="single" w:sz="4" w:color="BBBBBB"/>
+            </w:tcBorders>
+          </w:tcPr>
+          <w:p>
+            <w:pPr>
+              <w:pStyle w:val="Compact"/>
+              <w:jc w:val="right"/>
+            </w:pPr>
+            <w:r>
+              <w:rPr>
+                <w:sz w:val="15"/>
+              </w:rPr>
+              <w:t xml:space="preserve">2</w:t>
+            </w:r>
+          </w:p>
+        </w:tc>
+        <w:tc>
+          <w:tcPr>
+            <w:tcW w:type="dxa" w:w="3318"/>
+            <w:tcBorders>
+              <w:top w:val="single" w:sz="4" w:color="BBBBBB"/>
+              <w:bottom w:val="single" w:sz="4" w:color="BBBBBB"/>
+            </w:tcBorders>
+          </w:tcPr>
+          <w:p>
+            <w:pPr>
+              <w:pStyle w:val="Compact"/>
+              <w:jc w:val="left"/>
+            </w:pPr>
+            <w:r>
+              <w:rPr>
+                <w:sz w:val="15"/>
+              </w:rPr>
+              <w:t xml:space="preserve">No clear winner in our data; try both and compare at your budget.</w:t>
+            </w:r>
+          </w:p>
+        </w:tc>
+      </w:tr>
+    </w:tbl>
+    <w:p>
+      <w:pPr>
+        <w:pStyle w:val="BodyText"/>
+      </w:pPr>
+      <w:r>
+        <w:rPr>
+          <w:iCs/>
+          <w:i/>
+          <w:sz w:val="20"/>
+        </w:rPr>
+        <w:t xml:space="preserve">Table 3. Outcomes at 1,024 runs by number of inputs p (all 36 problems).</w:t>
+      </w:r>
+    </w:p>
+    <w:p>
+      <w:pPr>
+        <w:pStyle w:val="BodyText"/>
       </w:pPr>
       <w:r>
         <w:rPr>
@@ -2326,7 +2768,7 @@
         <w:rPr>
           <w:sz w:val="20"/>
         </w:rPr>
-        <w:t xml:space="preserve">On problems with up to four inputs the reduced basis was clearly better in 20 of 30 cases at 1,024 runs (networks in 8), and a GP needs no long training. Give its regularisation a wide search range. (Moderate for p ≤ 4 on our problems; unresolved for many inputs.)</w:t>
+        <w:t xml:space="preserve">On problems with up to four inputs the reduced basis was clearly better in 20 of 30 cases at 1,024 runs (networks in 8), and a GP needs no long training. Give its regularisation a wide search range. We have no reliable way to tell in advance whether your problem is smooth enough (Section 4.4). (Moderate for p ≤ 4 on our problems; unresolved for many inputs.)</w:t>
       </w:r>
     </w:p>
     <w:p>
@@ -2355,7 +2797,7 @@
         <w:rPr>
           <w:sz w:val="20"/>
         </w:rPr>
-        <w:t xml:space="preserve">It takes a fraction of a second and, on our problems, still clearly beat the best neural network in nearly half the cells where the GP did. (Moderate.)</w:t>
+        <w:t xml:space="preserve">It takes a fraction of a second and, on our problems, still clearly beat the best neural network in 44% of the cells where the GP did. (Moderate.)</w:t>
       </w:r>
     </w:p>
     <w:p>
@@ -2372,19 +2814,19 @@
           <w:b/>
           <w:sz w:val="20"/>
         </w:rPr>
-        <w:t xml:space="preserve">Check whether POD is your bottleneck.</w:t>
-      </w:r>
-      <w:r>
-        <w:rPr>
-          <w:sz w:val="20"/>
-        </w:rPr>
-        <w:t xml:space="preserve"> </w:t>
-      </w:r>
-      <w:r>
-        <w:rPr>
-          <w:sz w:val="20"/>
-        </w:rPr>
-        <w:t xml:space="preserve">If the error of your stand-in equals the error of projecting the test data onto the same number of modes, a larger basis or a model without a basis will help more than a better regressor. (Illustrative: three problems.)</w:t>
+        <w:t xml:space="preserve">Check whether the basis is your bottleneck.</w:t>
+      </w:r>
+      <w:r>
+        <w:rPr>
+          <w:sz w:val="20"/>
+        </w:rPr>
+        <w:t xml:space="preserve"> </w:t>
+      </w:r>
+      <w:r>
+        <w:rPr>
+          <w:sz w:val="20"/>
+        </w:rPr>
+        <w:t xml:space="preserve">Project held-out fields onto your basis and compute the error. If your stand-in’s error is about equal to it, a larger basis or a model without a basis will help more than a better regressor. (Illustrative: we saw it on three problems; the check is cheap on your own data.)</w:t>
       </w:r>
     </w:p>
     <w:p>
@@ -2442,7 +2884,7 @@
         <w:rPr>
           <w:sz w:val="20"/>
         </w:rPr>
-        <w:t xml:space="preserve">Training longer, in double precision and with a polishing step, improved most networks and, in the longer-training experiment, changed the outcome on about a third of the cases we retrained. Do not conclude that a network cannot do better from a single 1,500-epoch run. (Strong.)</w:t>
+        <w:t xml:space="preserve">Training longer, in double precision and with a polishing step, improved most networks; in our four-times-longer experiment, the verdict changed in 15 of 48 cases, always toward the networks. Do not conclude that a network cannot do better from a single 1,500-epoch run. (Strong.)</w:t>
       </w:r>
     </w:p>
     <w:p>
@@ -2517,19 +2959,19 @@
           <w:b/>
           <w:sz w:val="20"/>
         </w:rPr>
-        <w:t xml:space="preserve">Do not rely on a pilot statistic to choose.</w:t>
-      </w:r>
-      <w:r>
-        <w:rPr>
-          <w:sz w:val="20"/>
-        </w:rPr>
-        <w:t xml:space="preserve"> </w:t>
-      </w:r>
-      <w:r>
-        <w:rPr>
-          <w:sz w:val="20"/>
-        </w:rPr>
-        <w:t xml:space="preserve">The quick check we tried was not reliable. (Weak evidence against, inconclusive.)</w:t>
+        <w:t xml:space="preserve">Do not choose by a quick pilot statistic yet.</w:t>
+      </w:r>
+      <w:r>
+        <w:rPr>
+          <w:sz w:val="20"/>
+        </w:rPr>
+        <w:t xml:space="preserve"> </w:t>
+      </w:r>
+      <w:r>
+        <w:rPr>
+          <w:sz w:val="20"/>
+        </w:rPr>
+        <w:t xml:space="preserve">The one we tested (how fast POD compresses 32 runs) did not predict the winner on eight new problems and mostly tracks the number of inputs; eight problems cannot rule out a weak effect. (Inconclusive.)</w:t>
       </w:r>
     </w:p>
     <w:bookmarkEnd w:id="37"/>
@@ -2547,13 +2989,285 @@
     </w:p>
     <w:p>
       <w:pPr>
-        <w:pStyle w:val="FirstParagraph"/>
-      </w:pPr>
-      <w:r>
-        <w:rPr>
-          <w:sz w:val="20"/>
-        </w:rPr>
-        <w:t xml:space="preserve">All our problems are simulated stand-ins, solved by our own code, on modest grids and with 3 to 32 inputs. We did not use field or industrial data, so the conclusions say how methods compare on these kinds of problems, not how they will perform on a particular application. The neural networks were only lightly tuned (eight random draws, one training recipe, shared draws across problems), and the 1,024-run results are affected by the doubling of the training steps. Better-tuned networks, other architectures such as Fourier neural operators, or very large budgets could change the picture; the evidence here favours the GP route for smooth low-dimensional problems and says little about problems with many inputs. Most of our statistical evidence is descriptive: we have 24 main problems in 12 families, the cases within a family are not independent, and several of the follow-up experiments were designed after we had seen earlier results. Our literature search was limited (mostly abstracts and bibliographic records), so the related work may be incomplete. The audits and reviews of our drafts were done by AI agents rather than human reviewers.</w:t>
+        <w:numPr>
+          <w:ilvl w:val="0"/>
+          <w:numId w:val="1002"/>
+        </w:numPr>
+        <w:pStyle w:val="Compact"/>
+      </w:pPr>
+      <w:r>
+        <w:rPr>
+          <w:bCs/>
+          <w:b/>
+          <w:sz w:val="20"/>
+        </w:rPr>
+        <w:t xml:space="preserve">Who checked this.</w:t>
+      </w:r>
+      <w:r>
+        <w:rPr>
+          <w:sz w:val="20"/>
+        </w:rPr>
+        <w:t xml:space="preserve"> </w:t>
+      </w:r>
+      <w:r>
+        <w:rPr>
+          <w:sz w:val="20"/>
+        </w:rPr>
+        <w:t xml:space="preserve">The analysis, the audits and the reviews of our drafts were done with AI agents, not human reviewers, and the version-control</w:t>
+      </w:r>
+      <w:r>
+        <w:rPr>
+          <w:sz w:val="20"/>
+        </w:rPr>
+        <w:t xml:space="preserve"> </w:t>
+      </w:r>
+      <w:r>
+        <w:rPr>
+          <w:sz w:val="20"/>
+        </w:rPr>
+        <w:t xml:space="preserve">“</w:t>
+      </w:r>
+      <w:r>
+        <w:rPr>
+          <w:sz w:val="20"/>
+        </w:rPr>
+        <w:t xml:space="preserve">pre-registration</w:t>
+      </w:r>
+      <w:r>
+        <w:rPr>
+          <w:sz w:val="20"/>
+        </w:rPr>
+        <w:t xml:space="preserve">”</w:t>
+      </w:r>
+      <w:r>
+        <w:rPr>
+          <w:sz w:val="20"/>
+        </w:rPr>
+        <w:t xml:space="preserve"> </w:t>
+      </w:r>
+      <w:r>
+        <w:rPr>
+          <w:sz w:val="20"/>
+        </w:rPr>
+        <w:t xml:space="preserve">is our own history (commit hashes in</w:t>
+      </w:r>
+      <w:r>
+        <w:rPr>
+          <w:sz w:val="20"/>
+        </w:rPr>
+        <w:t xml:space="preserve"> </w:t>
+      </w:r>
+      <w:r>
+        <w:rPr>
+          <w:rStyle w:val="VerbatimChar"/>
+          <w:sz w:val="20"/>
+        </w:rPr>
+        <w:t xml:space="preserve">research_design/</w:t>
+      </w:r>
+      <w:r>
+        <w:rPr>
+          <w:sz w:val="20"/>
+        </w:rPr>
+        <w:t xml:space="preserve"> </w:t>
+      </w:r>
+      <w:r>
+        <w:rPr>
+          <w:sz w:val="20"/>
+        </w:rPr>
+        <w:t xml:space="preserve">and</w:t>
+      </w:r>
+      <w:r>
+        <w:rPr>
+          <w:sz w:val="20"/>
+        </w:rPr>
+        <w:t xml:space="preserve"> </w:t>
+      </w:r>
+      <w:r>
+        <w:rPr>
+          <w:rStyle w:val="VerbatimChar"/>
+          <w:sz w:val="20"/>
+        </w:rPr>
+        <w:t xml:space="preserve">audit/prereg_order_check.json</w:t>
+      </w:r>
+      <w:r>
+        <w:rPr>
+          <w:sz w:val="20"/>
+        </w:rPr>
+        <w:t xml:space="preserve">), not an independent registry.</w:t>
+      </w:r>
+    </w:p>
+    <w:p>
+      <w:pPr>
+        <w:numPr>
+          <w:ilvl w:val="0"/>
+          <w:numId w:val="1002"/>
+        </w:numPr>
+        <w:pStyle w:val="Compact"/>
+      </w:pPr>
+      <w:r>
+        <w:rPr>
+          <w:bCs/>
+          <w:b/>
+          <w:sz w:val="20"/>
+        </w:rPr>
+        <w:t xml:space="preserve">Simulated problems only.</w:t>
+      </w:r>
+      <w:r>
+        <w:rPr>
+          <w:sz w:val="20"/>
+        </w:rPr>
+        <w:t xml:space="preserve"> </w:t>
+      </w:r>
+      <w:r>
+        <w:rPr>
+          <w:sz w:val="20"/>
+        </w:rPr>
+        <w:t xml:space="preserve">All 36 problems come from our own solvers, with modest grids and 3 to 32 inputs. We used no field data and no public benchmark such as PDEBench, so the conclusions say how methods compare on these kinds of problems, not how they will perform on a particular application.</w:t>
+      </w:r>
+    </w:p>
+    <w:p>
+      <w:pPr>
+        <w:numPr>
+          <w:ilvl w:val="0"/>
+          <w:numId w:val="1002"/>
+        </w:numPr>
+        <w:pStyle w:val="Compact"/>
+      </w:pPr>
+      <w:r>
+        <w:rPr>
+          <w:bCs/>
+          <w:b/>
+          <w:sz w:val="20"/>
+        </w:rPr>
+        <w:t xml:space="preserve">Lightly tuned networks.</w:t>
+      </w:r>
+      <w:r>
+        <w:rPr>
+          <w:sz w:val="20"/>
+        </w:rPr>
+        <w:t xml:space="preserve"> </w:t>
+      </w:r>
+      <w:r>
+        <w:rPr>
+          <w:sz w:val="20"/>
+        </w:rPr>
+        <w:t xml:space="preserve">Eight random draws, one training recipe, draws shared across problems, a doubling of training steps at 1,024 runs. Better-tuned networks, ensembles, or other architectures such as Fourier neural operators could change the picture.</w:t>
+      </w:r>
+    </w:p>
+    <w:p>
+      <w:pPr>
+        <w:numPr>
+          <w:ilvl w:val="0"/>
+          <w:numId w:val="1002"/>
+        </w:numPr>
+        <w:pStyle w:val="Compact"/>
+      </w:pPr>
+      <w:r>
+        <w:rPr>
+          <w:bCs/>
+          <w:b/>
+          <w:sz w:val="20"/>
+        </w:rPr>
+        <w:t xml:space="preserve">Little evidence for many inputs.</w:t>
+      </w:r>
+      <w:r>
+        <w:rPr>
+          <w:sz w:val="20"/>
+        </w:rPr>
+        <w:t xml:space="preserve"> </w:t>
+      </w:r>
+      <w:r>
+        <w:rPr>
+          <w:sz w:val="20"/>
+        </w:rPr>
+        <w:t xml:space="preserve">The mechanism experiments cover problems with three or four inputs; for 10 or more inputs we have five problems and no clear winner.</w:t>
+      </w:r>
+    </w:p>
+    <w:p>
+      <w:pPr>
+        <w:numPr>
+          <w:ilvl w:val="0"/>
+          <w:numId w:val="1002"/>
+        </w:numPr>
+        <w:pStyle w:val="Compact"/>
+      </w:pPr>
+      <w:r>
+        <w:rPr>
+          <w:bCs/>
+          <w:b/>
+          <w:sz w:val="20"/>
+        </w:rPr>
+        <w:t xml:space="preserve">Costs.</w:t>
+      </w:r>
+      <w:r>
+        <w:rPr>
+          <w:sz w:val="20"/>
+        </w:rPr>
+        <w:t xml:space="preserve"> </w:t>
+      </w:r>
+      <w:r>
+        <w:rPr>
+          <w:sz w:val="20"/>
+        </w:rPr>
+        <w:t xml:space="preserve">We report fitting time only, not the cost of using the trained model or of the simulations.</w:t>
+      </w:r>
+    </w:p>
+    <w:p>
+      <w:pPr>
+        <w:numPr>
+          <w:ilvl w:val="0"/>
+          <w:numId w:val="1002"/>
+        </w:numPr>
+        <w:pStyle w:val="Compact"/>
+      </w:pPr>
+      <w:r>
+        <w:rPr>
+          <w:bCs/>
+          <w:b/>
+          <w:sz w:val="20"/>
+        </w:rPr>
+        <w:t xml:space="preserve">Statistics.</w:t>
+      </w:r>
+      <w:r>
+        <w:rPr>
+          <w:sz w:val="20"/>
+        </w:rPr>
+        <w:t xml:space="preserve"> </w:t>
+      </w:r>
+      <w:r>
+        <w:rPr>
+          <w:sz w:val="20"/>
+        </w:rPr>
+        <w:t xml:space="preserve">We have 24 main problems in 12 families; cases within a family are not independent, and several follow-up experiments were designed after we had seen earlier results.</w:t>
+      </w:r>
+    </w:p>
+    <w:p>
+      <w:pPr>
+        <w:numPr>
+          <w:ilvl w:val="0"/>
+          <w:numId w:val="1002"/>
+        </w:numPr>
+        <w:pStyle w:val="Compact"/>
+      </w:pPr>
+      <w:r>
+        <w:rPr>
+          <w:bCs/>
+          <w:b/>
+          <w:sz w:val="20"/>
+        </w:rPr>
+        <w:t xml:space="preserve">Literature.</w:t>
+      </w:r>
+      <w:r>
+        <w:rPr>
+          <w:sz w:val="20"/>
+        </w:rPr>
+        <w:t xml:space="preserve"> </w:t>
+      </w:r>
+      <w:r>
+        <w:rPr>
+          <w:sz w:val="20"/>
+        </w:rPr>
+        <w:t xml:space="preserve">Our literature search was limited (mostly abstracts and bibliographic records), so the related work may be incomplete.</w:t>
       </w:r>
     </w:p>
     <w:bookmarkEnd w:id="38"/>
@@ -2577,7 +3291,7 @@
         <w:rPr>
           <w:sz w:val="20"/>
         </w:rPr>
-        <w:t xml:space="preserve">For slow simulations of smooth problems with a handful of inputs, a Gaussian-process stand-in is a strong default: it was usually far more accurate than lightly tuned neural networks, needed fewer simulation runs for high accuracy, and was cheap to build. Its advantage is not about the reduced basis; it is mainly about a smooth regressor with carefully searched regularisation. Neural networks were competitive for modest accuracy targets and for some problems with sharp moving features, and on harder or higher-dimensional problems we could not name a clear winner. The outcome of a comparison depends on the training budget, the tuning effort and the random draws, so a fair comparison needs equal effort, tie-aware reporting and a well-tuned Gaussian-process baseline.</w:t>
+        <w:t xml:space="preserve">For slow simulations of smooth problems with a handful of inputs, a Gaussian-process stand-in is a strong default: it was usually far more accurate than lightly tuned neural networks, needed fewer simulation runs to reach high accuracy, and took less time to fit than the networks we trained (a median of about 44 seconds against 90–140 at 1,024 runs). Its advantage is not about the reduced basis; much of it reflects a smooth regressor whose regularisation is searched widely and carefully, though a factor of 2 to 3 over a wide-range kernel ridge remains unexplained. Neural networks were competitive for modest accuracy targets and for some problems with sharp moving features, and on harder or higher-dimensional problems we could not name a clear winner. The outcome of a comparison depends on the training budget, the tuning effort and the random draws, so a fair comparison needs equal effort, tie-aware reporting and a well-tuned Gaussian-process baseline.</w:t>
       </w:r>
     </w:p>
     <w:bookmarkEnd w:id="39"/>
@@ -3096,6 +3810,82 @@
       <w:start w:val="1"/>
       <w:numFmt w:val="decimal"/>
       <w:lvlText w:val="%9."/>
+      <w:lvlJc w:val="left"/>
+      <w:pPr>
+        <w:ind w:left="6480" w:hanging="480"/>
+      </w:pPr>
+    </w:lvl>
+  </w:abstractNum>
+  <w:abstractNum w:abstractNumId="991">
+    <w:nsid w:val="A991"/>
+    <w:multiLevelType w:val="multilevel"/>
+    <w:lvl w:ilvl="0">
+      <w:numFmt w:val="bullet"/>
+      <w:lvlText w:val="•"/>
+      <w:lvlJc w:val="left"/>
+      <w:pPr>
+        <w:ind w:left="720" w:hanging="480"/>
+      </w:pPr>
+    </w:lvl>
+    <w:lvl w:ilvl="1">
+      <w:numFmt w:val="bullet"/>
+      <w:lvlText w:val="–"/>
+      <w:lvlJc w:val="left"/>
+      <w:pPr>
+        <w:ind w:left="1440" w:hanging="480"/>
+      </w:pPr>
+    </w:lvl>
+    <w:lvl w:ilvl="2">
+      <w:numFmt w:val="bullet"/>
+      <w:lvlText w:val="•"/>
+      <w:lvlJc w:val="left"/>
+      <w:pPr>
+        <w:ind w:left="2160" w:hanging="480"/>
+      </w:pPr>
+    </w:lvl>
+    <w:lvl w:ilvl="3">
+      <w:numFmt w:val="bullet"/>
+      <w:lvlText w:val="–"/>
+      <w:lvlJc w:val="left"/>
+      <w:pPr>
+        <w:ind w:left="2880" w:hanging="480"/>
+      </w:pPr>
+    </w:lvl>
+    <w:lvl w:ilvl="4">
+      <w:numFmt w:val="bullet"/>
+      <w:lvlText w:val="•"/>
+      <w:lvlJc w:val="left"/>
+      <w:pPr>
+        <w:ind w:left="3600" w:hanging="480"/>
+      </w:pPr>
+    </w:lvl>
+    <w:lvl w:ilvl="5">
+      <w:numFmt w:val="bullet"/>
+      <w:lvlText w:val="–"/>
+      <w:lvlJc w:val="left"/>
+      <w:pPr>
+        <w:ind w:left="4320" w:hanging="480"/>
+      </w:pPr>
+    </w:lvl>
+    <w:lvl w:ilvl="6">
+      <w:numFmt w:val="bullet"/>
+      <w:lvlText w:val="•"/>
+      <w:lvlJc w:val="left"/>
+      <w:pPr>
+        <w:ind w:left="5040" w:hanging="480"/>
+      </w:pPr>
+    </w:lvl>
+    <w:lvl w:ilvl="7">
+      <w:numFmt w:val="bullet"/>
+      <w:lvlText w:val="–"/>
+      <w:lvlJc w:val="left"/>
+      <w:pPr>
+        <w:ind w:left="5760" w:hanging="480"/>
+      </w:pPr>
+    </w:lvl>
+    <w:lvl w:ilvl="8">
+      <w:numFmt w:val="bullet"/>
+      <w:lvlText w:val="•"/>
       <w:lvlJc w:val="left"/>
       <w:pPr>
         <w:ind w:left="6480" w:hanging="480"/>
@@ -3134,6 +3924,9 @@
     <w:lvlOverride w:ilvl="8">
       <w:startOverride w:val="1"/>
     </w:lvlOverride>
+  </w:num>
+  <w:num w:numId="1002">
+    <w:abstractNumId w:val="991"/>
   </w:num>
 </w:numbering>
 </file>

</xml_diff>

<commit_message>
v4 third revision after round-3 review: cost caveat, reproducibility disclosure, Table 3 split, reference fix; round-3 triage
Co-Authored-By: Claude Sonnet 5.5 <noreply@anthropic.com>
Claude-Session: https://claude.ai/code/session_017fdFnBNWwmmqUrWFrpu4HP
</commit_message>
<xml_diff>
--- a/Reinforced_Research_Project/manuscript/Final_Manuscript_v4.docx
+++ b/Reinforced_Research_Project/manuscript/Final_Manuscript_v4.docx
@@ -1351,7 +1351,7 @@
               <a:graphicData uri="http://schemas.openxmlformats.org/drawingml/2006/picture">
                 <pic:pic>
                   <pic:nvPicPr>
-                    <pic:cNvPr descr="/home/user/rp_c_7/Reinforced_Research_Project/figures/figv2_outcomes_by_N.png" id="26" name="Picture"/>
+                    <pic:cNvPr descr="../figures/figv2_outcomes_by_N.png" id="26" name="Picture"/>
                     <pic:cNvPicPr>
                       <a:picLocks noChangeArrowheads="1" noChangeAspect="1"/>
                     </pic:cNvPicPr>
@@ -1795,7 +1795,7 @@
         <w:rPr>
           <w:sz w:val="20"/>
         </w:rPr>
-        <w:t xml:space="preserve">Training time is a minor cost compared with the simulations themselves but is not negligible. At 1,024 runs, tuning and fitting took a median of about 44 seconds of CPU time for the GP model, 86 for the POD+network, 116–139 for the direct networks, and about 0.3 seconds for the polynomial (each fit used one CPU thread; the software versions are recorded in the repository). We did not account for the cost of using the trained model, nor compare with the cost of the simulations themselves.</w:t>
+        <w:t xml:space="preserve">Fitting time is not free. At 1,024 runs, tuning and fitting took a median of about 44 seconds of CPU time for the GP model, 86 for the POD+network, 116–139 for the direct networks, and about 0.3 seconds for the polynomial (each fit used one CPU thread; software versions are recorded in the repository). A caveat on cost: our own solvers are fast, with a median of about 6 milliseconds per run, so on these test problems fitting a surrogate costs more than running the simulation 1,024 times for 27 of the 36 problems. The comparison that matters for slow simulations, where one run takes minutes or hours, is accuracy per simulation run, which is what Table 2 reports; we did not account for the cost of using a trained model.</w:t>
       </w:r>
     </w:p>
     <w:bookmarkEnd w:id="28"/>
@@ -1844,7 +1844,7 @@
         <w:rPr>
           <w:sz w:val="20"/>
         </w:rPr>
-        <w:t xml:space="preserve">A Gaussian process applied directly to the full output field, without any POD, was as accurate as the reduced-basis GP where the latter did well (median error ratio 0.95). Where networks had beaten the POD-based GP, the full-field GP often beat the networks again. On the heat problem with a narrow moving source (heat2d_L2) and the two inclusion problems (incl_L1, incl_L2), the POD+GP error (5.5e-02, 2.0e-03 and 4.6e-03) is essentially the best error any 32-mode basis could reach even with perfect weights (5.4e-02, 2.0e-03 and 4.2e-03). The basis, not the regressor, sets the limit. Networks that produce the whole field are not tied to a basis and can get below it. When we ran the full-field GP on the two moving-feature problems added later, it beat the best network by 1.2 and 1.0 orders of magnitude at 1,024 runs, where the POD+GP had lost to the networks.</w:t>
+        <w:t xml:space="preserve">A Gaussian process applied directly to the full output field, without any POD, was as accurate as the reduced-basis GP where the latter did well (median error ratio 0.95). Where networks had clearly beaten the POD-based GP, the full-field GP beat the best network clearly again in 7 of 30 problem-and-budget combinations (3 of 9 at 1,024 runs). On the heat problem with a narrow moving source (heat2d_L2) and the two inclusion problems (incl_L1, incl_L2), the POD+GP error (5.5e-02, 2.0e-03 and 4.6e-03) is essentially the best error any 32-mode basis could reach even with perfect weights (5.4e-02, 2.0e-03 and 4.2e-03). The basis, not the regressor, sets the limit. Networks that produce the whole field are not tied to a basis and can get below it. When we ran the full-field GP on the two moving-feature problems added later, it beat the best network by 1.2 and 1.0 orders of magnitude at 1,024 runs, where the POD+GP had lost to the networks.</w:t>
       </w:r>
     </w:p>
     <w:p>
@@ -1960,12 +1960,12 @@
           <wp:inline>
             <wp:extent cx="3733800" cy="1768642"/>
             <wp:effectExtent b="0" l="0" r="0" t="0"/>
-            <wp:docPr descr="Figure 2. Ratio of test errors (alternative over the Gaussian-process reduced model; above 1 means the alternative is worse), where that model clearly beats the best neural network. Each dot is one problem and budget; the dashed line marks a factor of 3. From the left: kernel ridge with a narrow search range (52 combinations, all budgets), kernel ridge with a wide search range and 8 tuning trials, the same with 32 trials, a Gaussian process with one length-scale, and a Gaussian process on the full field without a reduced basis (28 combinations each)." title="" id="30" name="Picture"/>
+            <wp:docPr descr="Figure 2. Ratio of test errors (alternative over the Gaussian-process reduced model; above 1 means the alternative is worse), where that model clearly beats the best neural network. Each dot is one problem and budget; the dashed line marks a factor of 3. From the left: kernel ridge with a narrow search range, kernel ridge with a wide search range and 8 tuning trials, the same with 32 trials, a Gaussian process with one length-scale, and a Gaussian process on the full field without a reduced basis (28 combinations each)." title="" id="30" name="Picture"/>
             <a:graphic>
               <a:graphicData uri="http://schemas.openxmlformats.org/drawingml/2006/picture">
                 <pic:pic>
                   <pic:nvPicPr>
-                    <pic:cNvPr descr="/home/user/rp_c_7/Reinforced_Research_Project/manuscript/fig_mech4.png" id="31" name="Picture"/>
+                    <pic:cNvPr descr="fig_mech4.png" id="31" name="Picture"/>
                     <pic:cNvPicPr>
                       <a:picLocks noChangeArrowheads="1" noChangeAspect="1"/>
                     </pic:cNvPicPr>
@@ -2020,7 +2020,7 @@
         <w:rPr>
           <w:sz w:val="20"/>
         </w:rPr>
-        <w:t xml:space="preserve">Ratio of test errors (alternative over the Gaussian-process reduced model; above 1 means the alternative is worse), where that model clearly beats the best neural network. Each dot is one problem and budget; the dashed line marks a factor of 3. From the left: kernel ridge with a narrow search range (52 combinations, all budgets), kernel ridge with a wide search range and 8 tuning trials, the same with 32 trials, a Gaussian process with one length-scale, and a Gaussian process on the full field without a reduced basis (28 combinations each).</w:t>
+        <w:t xml:space="preserve">Ratio of test errors (alternative over the Gaussian-process reduced model; above 1 means the alternative is worse), where that model clearly beats the best neural network. Each dot is one problem and budget; the dashed line marks a factor of 3. From the left: kernel ridge with a narrow search range, kernel ridge with a wide search range and 8 tuning trials, the same with 32 trials, a Gaussian process with one length-scale, and a Gaussian process on the full field without a reduced basis (28 combinations each).</w:t>
       </w:r>
     </w:p>
     <w:bookmarkEnd w:id="32"/>
@@ -2728,7 +2728,7 @@
           <w:i/>
           <w:sz w:val="20"/>
         </w:rPr>
-        <w:t xml:space="preserve">Table 3. Outcomes at 1,024 runs by number of inputs p (all 36 problems).</w:t>
+        <w:t xml:space="preserve">Table 3. Outcomes at 1,024 runs by number of inputs p (all 36 problems). Seven of the problems with four or fewer inputs are among the eight smooth candidates we added because we expected the GP to do well; without them the counts for four or fewer inputs are 13 / 2 / 8.</w:t>
       </w:r>
     </w:p>
     <w:p>
@@ -2768,7 +2768,7 @@
         <w:rPr>
           <w:sz w:val="20"/>
         </w:rPr>
-        <w:t xml:space="preserve">On problems with up to four inputs the reduced basis was clearly better in 20 of 30 cases at 1,024 runs (networks in 8), and a GP needs no long training. Give its regularisation a wide search range. We have no reliable way to tell in advance whether your problem is smooth enough (Section 4.4). (Moderate for p ≤ 4 on our problems; unresolved for many inputs.)</w:t>
+        <w:t xml:space="preserve">On problems with up to four inputs the reduced basis was clearly better in 20 of 30 cases at 1,024 runs (networks in 8; 13 against 8 among the 23 that were not chosen for smoothness), and a GP needs no long training. Give its regularisation a wide search range. We have no reliable way to tell in advance whether your problem is smooth enough (Section 4.4). (Moderate for p ≤ 4 on our problems; unresolved for many inputs.)</w:t>
       </w:r>
     </w:p>
     <w:p>
@@ -3209,7 +3209,7 @@
         <w:rPr>
           <w:sz w:val="20"/>
         </w:rPr>
-        <w:t xml:space="preserve">We report fitting time only, not the cost of using the trained model or of the simulations.</w:t>
+        <w:t xml:space="preserve">Our solvers take milliseconds per run, so the fitting time exceeds the simulation time on most test problems; we did not account for the cost of using a trained model, and the case for surrogates rests on simulations that are much slower than ours.</w:t>
       </w:r>
     </w:p>
     <w:p>
@@ -3226,19 +3226,19 @@
           <w:b/>
           <w:sz w:val="20"/>
         </w:rPr>
-        <w:t xml:space="preserve">Statistics.</w:t>
-      </w:r>
-      <w:r>
-        <w:rPr>
-          <w:sz w:val="20"/>
-        </w:rPr>
-        <w:t xml:space="preserve"> </w:t>
-      </w:r>
-      <w:r>
-        <w:rPr>
-          <w:sz w:val="20"/>
-        </w:rPr>
-        <w:t xml:space="preserve">We have 24 main problems in 12 families; cases within a family are not independent, and several follow-up experiments were designed after we had seen earlier results.</w:t>
+        <w:t xml:space="preserve">Networks.</w:t>
+      </w:r>
+      <w:r>
+        <w:rPr>
+          <w:sz w:val="20"/>
+        </w:rPr>
+        <w:t xml:space="preserve"> </w:t>
+      </w:r>
+      <w:r>
+        <w:rPr>
+          <w:sz w:val="20"/>
+        </w:rPr>
+        <w:t xml:space="preserve">We did not separate the optimisation error of the networks from their generalisation error (training versus test error), so we cannot say whether their error floor of about 2·10⁻⁴ is an optimisation limit.</w:t>
       </w:r>
     </w:p>
     <w:p>
@@ -3255,6 +3255,64 @@
           <w:b/>
           <w:sz w:val="20"/>
         </w:rPr>
+        <w:t xml:space="preserve">Reproducibility.</w:t>
+      </w:r>
+      <w:r>
+        <w:rPr>
+          <w:sz w:val="20"/>
+        </w:rPr>
+        <w:t xml:space="preserve"> </w:t>
+      </w:r>
+      <w:r>
+        <w:rPr>
+          <w:sz w:val="20"/>
+        </w:rPr>
+        <w:t xml:space="preserve">The 16 original problems were run with a random-search seed that depended on the Python process (a bug we found and fixed afterwards). Replaying their stored best settings reproduces the stored errors exactly, but a complete re-run of the search can differ, by up to a factor of about 4 for single fits. The later experiments reproduce bit for bit in a fresh clone.</w:t>
+      </w:r>
+    </w:p>
+    <w:p>
+      <w:pPr>
+        <w:numPr>
+          <w:ilvl w:val="0"/>
+          <w:numId w:val="1002"/>
+        </w:numPr>
+        <w:pStyle w:val="Compact"/>
+      </w:pPr>
+      <w:r>
+        <w:rPr>
+          <w:bCs/>
+          <w:b/>
+          <w:sz w:val="20"/>
+        </w:rPr>
+        <w:t xml:space="preserve">Statistics.</w:t>
+      </w:r>
+      <w:r>
+        <w:rPr>
+          <w:sz w:val="20"/>
+        </w:rPr>
+        <w:t xml:space="preserve"> </w:t>
+      </w:r>
+      <w:r>
+        <w:rPr>
+          <w:sz w:val="20"/>
+        </w:rPr>
+        <w:t xml:space="preserve">We have 24 main problems in 12 families; cases within a family are not independent, and several follow-up experiments were designed after we had seen earlier results.</w:t>
+      </w:r>
+    </w:p>
+    <w:p>
+      <w:pPr>
+        <w:numPr>
+          <w:ilvl w:val="0"/>
+          <w:numId w:val="1002"/>
+        </w:numPr>
+        <w:pStyle w:val="Compact"/>
+      </w:pPr>
+      <w:r>
+        <w:rPr>
+          <w:bCs/>
+          <w:b/>
+          <w:sz w:val="20"/>
+        </w:rPr>
         <w:t xml:space="preserve">Literature.</w:t>
       </w:r>
       <w:r>
@@ -3291,7 +3349,7 @@
         <w:rPr>
           <w:sz w:val="20"/>
         </w:rPr>
-        <w:t xml:space="preserve">For slow simulations of smooth problems with a handful of inputs, a Gaussian-process stand-in is a strong default: it was usually far more accurate than lightly tuned neural networks, needed fewer simulation runs to reach high accuracy, and took less time to fit than the networks we trained (a median of about 44 seconds against 90–140 at 1,024 runs). Its advantage is not about the reduced basis; much of it reflects a smooth regressor whose regularisation is searched widely and carefully, though a factor of 2 to 3 over a wide-range kernel ridge remains unexplained. Neural networks were competitive for modest accuracy targets and for some problems with sharp moving features, and on harder or higher-dimensional problems we could not name a clear winner. The outcome of a comparison depends on the training budget, the tuning effort and the random draws, so a fair comparison needs equal effort, tie-aware reporting and a well-tuned Gaussian-process baseline.</w:t>
+        <w:t xml:space="preserve">For slow simulations of smooth problems with a handful of inputs, a Gaussian-process stand-in is a strong default: it was usually far more accurate than lightly tuned neural networks, needed fewer simulation runs to reach high accuracy, and took less time to fit than the networks we trained (a median of about 44 seconds against 90–140 at 1,024 runs, on a laptop-scale benchmark whose own simulations take milliseconds). Its advantage is not about the reduced basis; much of it reflects a smooth regressor whose regularisation is searched widely and carefully, though a factor of 2 to 3 over a wide-range kernel ridge remains unexplained. Neural networks were competitive for modest accuracy targets and for some problems with sharp moving features, and on harder or higher-dimensional problems we could not name a clear winner. The outcome of a comparison depends on the training budget, the tuning effort and the random draws, so a fair comparison needs equal effort, tie-aware reporting and a well-tuned Gaussian-process baseline.</w:t>
       </w:r>
     </w:p>
     <w:bookmarkEnd w:id="39"/>
@@ -3617,7 +3675,7 @@
         <w:rPr>
           <w:sz w:val="20"/>
         </w:rPr>
-        <w:t xml:space="preserve">[15] Westermann J, Huber B, O’Leary-Roseberry T (2026) Performance of neural and polynomial operator surrogates. arXiv:2604.00689.</w:t>
+        <w:t xml:space="preserve">[15] Westermann J, Huber B, O’Leary-Roseberry T, Zech J (2026) Performance of neural and polynomial operator surrogates. arXiv:2604.00689.</w:t>
       </w:r>
     </w:p>
     <w:bookmarkEnd w:id="41"/>

</xml_diff>